<commit_message>
day 11 almost done questions
</commit_message>
<xml_diff>
--- a/Received/1/1, English.docx
+++ b/Received/1/1, English.docx
@@ -67,6 +67,15 @@
                               </w:rPr>
                               <w:t>D-</w:t>
                             </w:r>
+                            <w:r>
+                              <w:rPr>
+                                <w:rFonts w:ascii="Times New Roman" w:eastAsia="Times New Roman" w:hAnsi="Times New Roman" w:cs="Times New Roman"/>
+                                <w:b/>
+                                <w:color w:val="000000"/>
+                                <w:sz w:val="32"/>
+                              </w:rPr>
+                              <w:t xml:space="preserve"> 11</w:t>
+                            </w:r>
                           </w:p>
                         </w:txbxContent>
                       </wps:txbx>
@@ -103,6 +112,15 @@
                           <w:sz w:val="32"/>
                         </w:rPr>
                         <w:t>D-</w:t>
+                      </w:r>
+                      <w:r>
+                        <w:rPr>
+                          <w:rFonts w:ascii="Times New Roman" w:eastAsia="Times New Roman" w:hAnsi="Times New Roman" w:cs="Times New Roman"/>
+                          <w:b/>
+                          <w:color w:val="000000"/>
+                          <w:sz w:val="32"/>
+                        </w:rPr>
+                        <w:t xml:space="preserve"> 11</w:t>
                       </w:r>
                     </w:p>
                   </w:txbxContent>
@@ -248,29 +266,7 @@
           <w:sz w:val="24"/>
           <w:szCs w:val="24"/>
         </w:rPr>
-        <w:t xml:space="preserve">Ratnanagar-7, </w:t>
-      </w:r>
-      <w:proofErr w:type="spellStart"/>
-      <w:r>
-        <w:rPr>
-          <w:rFonts w:ascii="Times New Roman" w:eastAsia="Times New Roman" w:hAnsi="Times New Roman" w:cs="Times New Roman"/>
-          <w:b/>
-          <w:bCs/>
-          <w:sz w:val="24"/>
-          <w:szCs w:val="24"/>
-        </w:rPr>
-        <w:t>Sauraha</w:t>
-      </w:r>
-      <w:proofErr w:type="spellEnd"/>
-      <w:r>
-        <w:rPr>
-          <w:rFonts w:ascii="Times New Roman" w:eastAsia="Times New Roman" w:hAnsi="Times New Roman" w:cs="Times New Roman"/>
-          <w:b/>
-          <w:bCs/>
-          <w:sz w:val="24"/>
-          <w:szCs w:val="24"/>
-        </w:rPr>
-        <w:t>, Chitwan</w:t>
+        <w:t>Ratnanagar-7, Sauraha, Chitwan</w:t>
       </w:r>
     </w:p>
     <w:p>
@@ -371,47 +367,7 @@
           <w:sz w:val="24"/>
           <w:szCs w:val="24"/>
         </w:rPr>
-        <w:t xml:space="preserve">Time: - </w:t>
-      </w:r>
-      <w:r>
-        <w:rPr>
-          <w:rFonts w:ascii="Times New Roman" w:eastAsia="Times New Roman" w:hAnsi="Times New Roman" w:cs="Times New Roman"/>
-          <w:b/>
-          <w:bCs/>
-          <w:sz w:val="24"/>
-          <w:szCs w:val="24"/>
-        </w:rPr>
-        <w:t>2</w:t>
-      </w:r>
-      <w:r>
-        <w:rPr>
-          <w:rFonts w:ascii="Times New Roman" w:eastAsia="Times New Roman" w:hAnsi="Times New Roman" w:cs="Times New Roman"/>
-          <w:b/>
-          <w:bCs/>
-          <w:sz w:val="24"/>
-          <w:szCs w:val="24"/>
-        </w:rPr>
-        <w:t xml:space="preserve"> hr</w:t>
-      </w:r>
-      <w:r>
-        <w:rPr>
-          <w:rFonts w:ascii="Times New Roman" w:eastAsia="Times New Roman" w:hAnsi="Times New Roman" w:cs="Times New Roman"/>
-          <w:b/>
-          <w:bCs/>
-          <w:sz w:val="24"/>
-          <w:szCs w:val="24"/>
-        </w:rPr>
-        <w:t>s</w:t>
-      </w:r>
-      <w:r>
-        <w:rPr>
-          <w:rFonts w:ascii="Times New Roman" w:eastAsia="Times New Roman" w:hAnsi="Times New Roman" w:cs="Times New Roman"/>
-          <w:b/>
-          <w:bCs/>
-          <w:sz w:val="24"/>
-          <w:szCs w:val="24"/>
-        </w:rPr>
-        <w:t>.</w:t>
+        <w:t>Time: - 2 hrs.</w:t>
       </w:r>
       <w:r>
         <w:rPr>
@@ -506,17 +462,7 @@
           <w:sz w:val="28"/>
           <w:szCs w:val="28"/>
         </w:rPr>
-        <w:t xml:space="preserve">Sub: </w:t>
-      </w:r>
-      <w:r>
-        <w:rPr>
-          <w:rFonts w:ascii="Times New Roman" w:eastAsia="Times New Roman" w:hAnsi="Times New Roman" w:cs="Times New Roman"/>
-          <w:b/>
-          <w:bCs/>
-          <w:sz w:val="28"/>
-          <w:szCs w:val="28"/>
-        </w:rPr>
-        <w:t>English I</w:t>
+        <w:t>Sub: English I</w:t>
       </w:r>
     </w:p>
     <w:tbl>
@@ -753,6 +699,16 @@
         </w:rPr>
         <w:t>Q.no 1.  Read the passage and answer the following question</w:t>
       </w:r>
+      <w:r>
+        <w:rPr>
+          <w:rFonts w:ascii="Times New Roman" w:hAnsi="Times New Roman" w:cs="Times New Roman"/>
+          <w:b/>
+          <w:bCs/>
+          <w:sz w:val="28"/>
+          <w:szCs w:val="28"/>
+        </w:rPr>
+        <w:t>.</w:t>
+      </w:r>
     </w:p>
     <w:p>
       <w:pPr>
@@ -1041,7 +997,7 @@
           </mc:Choice>
           <mc:Fallback>
             <w:pict>
-              <v:rect w14:anchorId="091B95C7" id="Rectangle 1" o:spid="_x0000_s1026" style="position:absolute;margin-left:220.8pt;margin-top:3.55pt;width:56.4pt;height:16.1pt;z-index:251657728;visibility:visible;mso-wrap-style:square;mso-wrap-distance-left:9pt;mso-wrap-distance-top:0;mso-wrap-distance-right:9pt;mso-wrap-distance-bottom:0;mso-position-horizontal:absolute;mso-position-horizontal-relative:text;mso-position-vertical:absolute;mso-position-vertical-relative:text;v-text-anchor:middle" o:gfxdata="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" filled="f" strokecolor="black [3213]" strokeweight=".25pt"/>
+              <v:rect w14:anchorId="35807ADE" id="Rectangle 1" o:spid="_x0000_s1026" style="position:absolute;margin-left:220.8pt;margin-top:3.55pt;width:56.4pt;height:16.1pt;z-index:251657728;visibility:visible;mso-wrap-style:square;mso-wrap-distance-left:9pt;mso-wrap-distance-top:0;mso-wrap-distance-right:9pt;mso-wrap-distance-bottom:0;mso-position-horizontal:absolute;mso-position-horizontal-relative:text;mso-position-vertical:absolute;mso-position-vertical-relative:text;v-text-anchor:middle" o:gfxdata="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" filled="f" strokecolor="black [3213]" strokeweight=".25pt"/>
             </w:pict>
           </mc:Fallback>
         </mc:AlternateContent>
@@ -1143,7 +1099,7 @@
           </mc:Choice>
           <mc:Fallback>
             <w:pict>
-              <v:rect w14:anchorId="26E6423B" id="Rectangle 1" o:spid="_x0000_s1026" style="position:absolute;margin-left:167.75pt;margin-top:3.35pt;width:56.4pt;height:16.1pt;z-index:251659776;visibility:visible;mso-wrap-style:square;mso-wrap-distance-left:9pt;mso-wrap-distance-top:0;mso-wrap-distance-right:9pt;mso-wrap-distance-bottom:0;mso-position-horizontal:absolute;mso-position-horizontal-relative:text;mso-position-vertical:absolute;mso-position-vertical-relative:text;v-text-anchor:middle" o:gfxdata="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" filled="f" strokecolor="black [3213]" strokeweight=".25pt"/>
+              <v:rect w14:anchorId="0E191EAC" id="Rectangle 1" o:spid="_x0000_s1026" style="position:absolute;margin-left:167.75pt;margin-top:3.35pt;width:56.4pt;height:16.1pt;z-index:251659776;visibility:visible;mso-wrap-style:square;mso-wrap-distance-left:9pt;mso-wrap-distance-top:0;mso-wrap-distance-right:9pt;mso-wrap-distance-bottom:0;mso-position-horizontal:absolute;mso-position-horizontal-relative:text;mso-position-vertical:absolute;mso-position-vertical-relative:text;v-text-anchor:middle" o:gfxdata="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" filled="f" strokecolor="black [3213]" strokeweight=".25pt"/>
             </w:pict>
           </mc:Fallback>
         </mc:AlternateContent>
@@ -1245,7 +1201,7 @@
           </mc:Choice>
           <mc:Fallback>
             <w:pict>
-              <v:rect w14:anchorId="0868F928" id="Rectangle 1" o:spid="_x0000_s1026" style="position:absolute;margin-left:153.15pt;margin-top:4.3pt;width:56.4pt;height:16.1pt;z-index:251661824;visibility:visible;mso-wrap-style:square;mso-wrap-distance-left:9pt;mso-wrap-distance-top:0;mso-wrap-distance-right:9pt;mso-wrap-distance-bottom:0;mso-position-horizontal:absolute;mso-position-horizontal-relative:text;mso-position-vertical:absolute;mso-position-vertical-relative:text;v-text-anchor:middle" o:gfxdata="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" filled="f" strokecolor="black [3213]" strokeweight=".25pt"/>
+              <v:rect w14:anchorId="0F42B1ED" id="Rectangle 1" o:spid="_x0000_s1026" style="position:absolute;margin-left:153.15pt;margin-top:4.3pt;width:56.4pt;height:16.1pt;z-index:251661824;visibility:visible;mso-wrap-style:square;mso-wrap-distance-left:9pt;mso-wrap-distance-top:0;mso-wrap-distance-right:9pt;mso-wrap-distance-bottom:0;mso-position-horizontal:absolute;mso-position-horizontal-relative:text;mso-position-vertical:absolute;mso-position-vertical-relative:text;v-text-anchor:middle" o:gfxdata="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" filled="f" strokecolor="black [3213]" strokeweight=".25pt"/>
             </w:pict>
           </mc:Fallback>
         </mc:AlternateContent>
@@ -1721,25 +1677,7 @@
           <w:sz w:val="28"/>
           <w:szCs w:val="28"/>
         </w:rPr>
-        <w:t xml:space="preserve">grandparents __________ in </w:t>
-      </w:r>
-      <w:proofErr w:type="spellStart"/>
-      <w:r>
-        <w:rPr>
-          <w:rFonts w:ascii="Times New Roman" w:hAnsi="Times New Roman" w:cs="Times New Roman"/>
-          <w:sz w:val="28"/>
-          <w:szCs w:val="28"/>
-        </w:rPr>
-        <w:t>Tanahun</w:t>
-      </w:r>
-      <w:proofErr w:type="spellEnd"/>
-      <w:r>
-        <w:rPr>
-          <w:rFonts w:ascii="Times New Roman" w:hAnsi="Times New Roman" w:cs="Times New Roman"/>
-          <w:sz w:val="28"/>
-          <w:szCs w:val="28"/>
-        </w:rPr>
-        <w:t>.</w:t>
+        <w:t>grandparents __________ in Tanahun.</w:t>
       </w:r>
     </w:p>
     <w:p>
@@ -1787,18 +1725,8 @@
           <w:sz w:val="28"/>
           <w:szCs w:val="28"/>
         </w:rPr>
-        <w:t>Binu and Yam are _______</w:t>
-      </w:r>
-      <w:proofErr w:type="gramStart"/>
-      <w:r>
-        <w:rPr>
-          <w:rFonts w:ascii="Times New Roman" w:hAnsi="Times New Roman" w:cs="Times New Roman"/>
-          <w:sz w:val="28"/>
-          <w:szCs w:val="28"/>
-        </w:rPr>
-        <w:t>_ .</w:t>
-      </w:r>
-      <w:proofErr w:type="gramEnd"/>
+        <w:t>Binu and Yam are ________ .</w:t>
+      </w:r>
     </w:p>
     <w:p>
       <w:pPr>
@@ -2492,15 +2420,7 @@
           <w:sz w:val="28"/>
           <w:szCs w:val="28"/>
         </w:rPr>
-        <w:t xml:space="preserve"> </w:t>
-      </w:r>
-      <w:r>
-        <w:rPr>
-          <w:rFonts w:ascii="Times New Roman" w:hAnsi="Times New Roman" w:cs="Times New Roman"/>
-          <w:sz w:val="28"/>
-          <w:szCs w:val="28"/>
-        </w:rPr>
-        <w:t>_______________</w:t>
+        <w:t xml:space="preserve"> _______________</w:t>
       </w:r>
     </w:p>
     <w:p>
@@ -2551,15 +2471,7 @@
           <w:sz w:val="28"/>
           <w:szCs w:val="28"/>
         </w:rPr>
-        <w:t xml:space="preserve"> </w:t>
-      </w:r>
-      <w:r>
-        <w:rPr>
-          <w:rFonts w:ascii="Times New Roman" w:hAnsi="Times New Roman" w:cs="Times New Roman"/>
-          <w:sz w:val="28"/>
-          <w:szCs w:val="28"/>
-        </w:rPr>
-        <w:t>_______________</w:t>
+        <w:t xml:space="preserve"> _______________</w:t>
       </w:r>
     </w:p>
     <w:p>
@@ -2610,15 +2522,7 @@
           <w:sz w:val="28"/>
           <w:szCs w:val="28"/>
         </w:rPr>
-        <w:t xml:space="preserve"> </w:t>
-      </w:r>
-      <w:r>
-        <w:rPr>
-          <w:rFonts w:ascii="Times New Roman" w:hAnsi="Times New Roman" w:cs="Times New Roman"/>
-          <w:sz w:val="28"/>
-          <w:szCs w:val="28"/>
-        </w:rPr>
-        <w:t>_______________</w:t>
+        <w:t xml:space="preserve"> _______________</w:t>
       </w:r>
     </w:p>
     <w:p>
@@ -2783,18 +2687,8 @@
           <w:sz w:val="28"/>
           <w:szCs w:val="28"/>
         </w:rPr>
-        <w:t xml:space="preserve">           </w:t>
-      </w:r>
-      <w:proofErr w:type="spellStart"/>
-      <w:r>
-        <w:rPr>
-          <w:rFonts w:ascii="Times New Roman" w:hAnsi="Times New Roman" w:cs="Times New Roman"/>
-          <w:sz w:val="28"/>
-          <w:szCs w:val="28"/>
-        </w:rPr>
-        <w:t>Favourite</w:t>
-      </w:r>
-      <w:proofErr w:type="spellEnd"/>
+        <w:t xml:space="preserve">           Favourite</w:t>
+      </w:r>
       <w:r>
         <w:rPr>
           <w:rFonts w:ascii="Times New Roman" w:hAnsi="Times New Roman" w:cs="Times New Roman"/>
@@ -3437,7 +3331,6 @@
         </w:rPr>
         <w:t xml:space="preserve">            </w:t>
       </w:r>
-      <w:proofErr w:type="spellStart"/>
       <w:r>
         <w:rPr>
           <w:rFonts w:ascii="Times New Roman" w:hAnsi="Times New Roman" w:cs="Times New Roman"/>
@@ -3446,7 +3339,6 @@
         </w:rPr>
         <w:t>kspi</w:t>
       </w:r>
-      <w:proofErr w:type="spellEnd"/>
       <w:r>
         <w:rPr>
           <w:rFonts w:ascii="Times New Roman" w:hAnsi="Times New Roman" w:cs="Times New Roman"/>
@@ -3501,15 +3393,7 @@
           <w:sz w:val="28"/>
           <w:szCs w:val="28"/>
         </w:rPr>
-        <w:t xml:space="preserve">- </w:t>
-      </w:r>
-      <w:r>
-        <w:rPr>
-          <w:rFonts w:ascii="Times New Roman" w:hAnsi="Times New Roman" w:cs="Times New Roman"/>
-          <w:sz w:val="28"/>
-          <w:szCs w:val="28"/>
-        </w:rPr>
-        <w:t>___________</w:t>
+        <w:t>- ___________</w:t>
       </w:r>
     </w:p>
     <w:p>
@@ -3530,7 +3414,6 @@
         </w:rPr>
         <w:t xml:space="preserve">            </w:t>
       </w:r>
-      <w:proofErr w:type="spellStart"/>
       <w:r>
         <w:rPr>
           <w:rFonts w:ascii="Times New Roman" w:hAnsi="Times New Roman" w:cs="Times New Roman"/>
@@ -3539,7 +3422,6 @@
         </w:rPr>
         <w:t>anbana</w:t>
       </w:r>
-      <w:proofErr w:type="spellEnd"/>
       <w:r>
         <w:rPr>
           <w:rFonts w:ascii="Times New Roman" w:hAnsi="Times New Roman" w:cs="Times New Roman"/>
@@ -3554,6 +3436,30 @@
           <w:sz w:val="28"/>
           <w:szCs w:val="28"/>
         </w:rPr>
+        <w:t xml:space="preserve"> ___________</w:t>
+      </w:r>
+      <w:r>
+        <w:rPr>
+          <w:rFonts w:ascii="Times New Roman" w:hAnsi="Times New Roman" w:cs="Times New Roman"/>
+          <w:sz w:val="28"/>
+          <w:szCs w:val="28"/>
+        </w:rPr>
+        <w:t xml:space="preserve">           </w:t>
+      </w:r>
+      <w:r>
+        <w:rPr>
+          <w:rFonts w:ascii="Times New Roman" w:hAnsi="Times New Roman" w:cs="Times New Roman"/>
+          <w:sz w:val="28"/>
+          <w:szCs w:val="28"/>
+        </w:rPr>
+        <w:t xml:space="preserve">                            </w:t>
+      </w:r>
+      <w:r>
+        <w:rPr>
+          <w:rFonts w:ascii="Times New Roman" w:hAnsi="Times New Roman" w:cs="Times New Roman"/>
+          <w:sz w:val="28"/>
+          <w:szCs w:val="28"/>
+        </w:rPr>
         <w:t xml:space="preserve"> </w:t>
       </w:r>
       <w:r>
@@ -3562,23 +3468,7 @@
           <w:sz w:val="28"/>
           <w:szCs w:val="28"/>
         </w:rPr>
-        <w:t>___________</w:t>
-      </w:r>
-      <w:r>
-        <w:rPr>
-          <w:rFonts w:ascii="Times New Roman" w:hAnsi="Times New Roman" w:cs="Times New Roman"/>
-          <w:sz w:val="28"/>
-          <w:szCs w:val="28"/>
-        </w:rPr>
-        <w:t xml:space="preserve">           </w:t>
-      </w:r>
-      <w:r>
-        <w:rPr>
-          <w:rFonts w:ascii="Times New Roman" w:hAnsi="Times New Roman" w:cs="Times New Roman"/>
-          <w:sz w:val="28"/>
-          <w:szCs w:val="28"/>
-        </w:rPr>
-        <w:t xml:space="preserve">                            </w:t>
+        <w:t>tapoto</w:t>
       </w:r>
       <w:r>
         <w:rPr>
@@ -3588,39 +3478,13 @@
         </w:rPr>
         <w:t xml:space="preserve"> </w:t>
       </w:r>
-      <w:proofErr w:type="spellStart"/>
-      <w:r>
-        <w:rPr>
-          <w:rFonts w:ascii="Times New Roman" w:hAnsi="Times New Roman" w:cs="Times New Roman"/>
-          <w:sz w:val="28"/>
-          <w:szCs w:val="28"/>
-        </w:rPr>
-        <w:t>tapoto</w:t>
-      </w:r>
-      <w:proofErr w:type="spellEnd"/>
-      <w:r>
-        <w:rPr>
-          <w:rFonts w:ascii="Times New Roman" w:hAnsi="Times New Roman" w:cs="Times New Roman"/>
-          <w:sz w:val="28"/>
-          <w:szCs w:val="28"/>
-        </w:rPr>
-        <w:t xml:space="preserve"> </w:t>
-      </w:r>
-      <w:r>
-        <w:rPr>
-          <w:rFonts w:ascii="Times New Roman" w:hAnsi="Times New Roman" w:cs="Times New Roman"/>
-          <w:sz w:val="28"/>
-          <w:szCs w:val="28"/>
-        </w:rPr>
-        <w:t xml:space="preserve">- </w:t>
-      </w:r>
-      <w:r>
-        <w:rPr>
-          <w:rFonts w:ascii="Times New Roman" w:hAnsi="Times New Roman" w:cs="Times New Roman"/>
-          <w:sz w:val="28"/>
-          <w:szCs w:val="28"/>
-        </w:rPr>
-        <w:t>___________</w:t>
+      <w:r>
+        <w:rPr>
+          <w:rFonts w:ascii="Times New Roman" w:hAnsi="Times New Roman" w:cs="Times New Roman"/>
+          <w:sz w:val="28"/>
+          <w:szCs w:val="28"/>
+        </w:rPr>
+        <w:t>- ___________</w:t>
       </w:r>
     </w:p>
     <w:p>
@@ -3764,15 +3628,7 @@
           <w:sz w:val="28"/>
           <w:szCs w:val="28"/>
         </w:rPr>
-        <w:t xml:space="preserve"> </w:t>
-      </w:r>
-      <w:r>
-        <w:rPr>
-          <w:rFonts w:ascii="Times New Roman" w:hAnsi="Times New Roman" w:cs="Times New Roman"/>
-          <w:sz w:val="28"/>
-          <w:szCs w:val="28"/>
-        </w:rPr>
-        <w:t>___________</w:t>
+        <w:t xml:space="preserve"> ___________</w:t>
       </w:r>
     </w:p>
     <w:p>
@@ -3815,15 +3671,7 @@
           <w:sz w:val="28"/>
           <w:szCs w:val="28"/>
         </w:rPr>
-        <w:t xml:space="preserve"> </w:t>
-      </w:r>
-      <w:r>
-        <w:rPr>
-          <w:rFonts w:ascii="Times New Roman" w:hAnsi="Times New Roman" w:cs="Times New Roman"/>
-          <w:sz w:val="28"/>
-          <w:szCs w:val="28"/>
-        </w:rPr>
-        <w:t>___________</w:t>
+        <w:t xml:space="preserve"> ___________</w:t>
       </w:r>
     </w:p>
     <w:p>

</xml_diff>

<commit_message>
D- 11 &12 sent for proofing after first proofread edit
</commit_message>
<xml_diff>
--- a/Received/1/1, English.docx
+++ b/Received/1/1, English.docx
@@ -21,16 +21,16 @@
         <mc:AlternateContent>
           <mc:Choice Requires="wps">
             <w:drawing>
-              <wp:anchor distT="45720" distB="45720" distL="114300" distR="114300" simplePos="0" relativeHeight="251653632" behindDoc="0" locked="0" layoutInCell="1" hidden="0" allowOverlap="1" wp14:anchorId="14DDBF63" wp14:editId="1A0403F9">
+              <wp:anchor distT="45720" distB="45720" distL="114300" distR="114300" simplePos="0" relativeHeight="251653632" behindDoc="0" locked="0" layoutInCell="1" hidden="0" allowOverlap="1" wp14:anchorId="14DDBF63" wp14:editId="311F666A">
                 <wp:simplePos x="0" y="0"/>
                 <wp:positionH relativeFrom="column">
-                  <wp:posOffset>5829300</wp:posOffset>
+                  <wp:posOffset>5831457</wp:posOffset>
                 </wp:positionH>
                 <wp:positionV relativeFrom="paragraph">
-                  <wp:posOffset>-47625</wp:posOffset>
+                  <wp:posOffset>-3235</wp:posOffset>
                 </wp:positionV>
-                <wp:extent cx="896620" cy="466725"/>
-                <wp:effectExtent l="0" t="0" r="0" b="9525"/>
+                <wp:extent cx="672860" cy="284672"/>
+                <wp:effectExtent l="0" t="0" r="0" b="1270"/>
                 <wp:wrapNone/>
                 <wp:docPr id="220" name="Rectangle 220"/>
                 <wp:cNvGraphicFramePr/>
@@ -41,7 +41,7 @@
                       <wps:spPr>
                         <a:xfrm>
                           <a:off x="0" y="0"/>
-                          <a:ext cx="896620" cy="466725"/>
+                          <a:ext cx="672860" cy="284672"/>
                         </a:xfrm>
                         <a:prstGeom prst="rect">
                           <a:avLst/>
@@ -96,7 +96,7 @@
           </mc:Choice>
           <mc:Fallback>
             <w:pict>
-              <v:rect w14:anchorId="14DDBF63" id="Rectangle 220" o:spid="_x0000_s1026" style="position:absolute;margin-left:459pt;margin-top:-3.75pt;width:70.6pt;height:36.75pt;z-index:251653632;visibility:visible;mso-wrap-style:square;mso-width-percent:0;mso-height-percent:0;mso-wrap-distance-left:9pt;mso-wrap-distance-top:3.6pt;mso-wrap-distance-right:9pt;mso-wrap-distance-bottom:3.6pt;mso-position-horizontal:absolute;mso-position-horizontal-relative:text;mso-position-vertical:absolute;mso-position-vertical-relative:text;mso-width-percent:0;mso-height-percent:0;mso-width-relative:margin;mso-height-relative:margin;v-text-anchor:top" o:gfxdata="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" filled="f" stroked="f">
+              <v:rect w14:anchorId="14DDBF63" id="Rectangle 220" o:spid="_x0000_s1026" style="position:absolute;margin-left:459.15pt;margin-top:-.25pt;width:53pt;height:22.4pt;z-index:251653632;visibility:visible;mso-wrap-style:square;mso-width-percent:0;mso-height-percent:0;mso-wrap-distance-left:9pt;mso-wrap-distance-top:3.6pt;mso-wrap-distance-right:9pt;mso-wrap-distance-bottom:3.6pt;mso-position-horizontal:absolute;mso-position-horizontal-relative:text;mso-position-vertical:absolute;mso-position-vertical-relative:text;mso-width-percent:0;mso-height-percent:0;mso-width-relative:margin;mso-height-relative:margin;v-text-anchor:top" o:gfxdata="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" filled="f" stroked="f">
                 <v:textbox inset="2.53958mm,1.2694mm,2.53958mm,1.2694mm">
                   <w:txbxContent>
                     <w:p>
@@ -266,7 +266,29 @@
           <w:sz w:val="24"/>
           <w:szCs w:val="24"/>
         </w:rPr>
-        <w:t>Ratnanagar-7, Sauraha, Chitwan</w:t>
+        <w:t xml:space="preserve">Ratnanagar-7, </w:t>
+      </w:r>
+      <w:proofErr w:type="spellStart"/>
+      <w:r>
+        <w:rPr>
+          <w:rFonts w:ascii="Times New Roman" w:eastAsia="Times New Roman" w:hAnsi="Times New Roman" w:cs="Times New Roman"/>
+          <w:b/>
+          <w:bCs/>
+          <w:sz w:val="24"/>
+          <w:szCs w:val="24"/>
+        </w:rPr>
+        <w:t>Sauraha</w:t>
+      </w:r>
+      <w:proofErr w:type="spellEnd"/>
+      <w:r>
+        <w:rPr>
+          <w:rFonts w:ascii="Times New Roman" w:eastAsia="Times New Roman" w:hAnsi="Times New Roman" w:cs="Times New Roman"/>
+          <w:b/>
+          <w:bCs/>
+          <w:sz w:val="24"/>
+          <w:szCs w:val="24"/>
+        </w:rPr>
+        <w:t>, Chitwan</w:t>
       </w:r>
     </w:p>
     <w:p>
@@ -437,7 +459,17 @@
           <w:sz w:val="28"/>
           <w:szCs w:val="28"/>
         </w:rPr>
-        <w:t>F.M: 25</w:t>
+        <w:t>F.M: 5</w:t>
+      </w:r>
+      <w:r>
+        <w:rPr>
+          <w:rFonts w:ascii="Times New Roman" w:eastAsia="Times New Roman" w:hAnsi="Times New Roman" w:cs="Times New Roman"/>
+          <w:b/>
+          <w:bCs/>
+          <w:sz w:val="28"/>
+          <w:szCs w:val="28"/>
+        </w:rPr>
+        <w:t>0</w:t>
       </w:r>
     </w:p>
     <w:p>
@@ -493,7 +525,7 @@
           </w:tcPr>
           <w:p>
             <w:pPr>
-              <w:spacing w:after="0"/>
+              <w:spacing w:after="0" w:line="240" w:lineRule="auto"/>
               <w:ind w:right="-653"/>
               <w:rPr>
                 <w:rFonts w:ascii="Times New Roman" w:eastAsia="Times New Roman" w:hAnsi="Times New Roman" w:cs="Times New Roman"/>
@@ -526,7 +558,7 @@
           </w:tcPr>
           <w:p>
             <w:pPr>
-              <w:spacing w:after="0"/>
+              <w:spacing w:after="0" w:line="240" w:lineRule="auto"/>
               <w:ind w:left="180" w:firstLine="360"/>
               <w:rPr>
                 <w:rFonts w:ascii="Times New Roman" w:eastAsia="Times New Roman" w:hAnsi="Times New Roman" w:cs="Times New Roman"/>
@@ -632,7 +664,7 @@
           </w:p>
           <w:p>
             <w:pPr>
-              <w:spacing w:after="0"/>
+              <w:spacing w:after="0" w:line="240" w:lineRule="auto"/>
               <w:ind w:left="180" w:firstLine="360"/>
               <w:rPr>
                 <w:rFonts w:ascii="Times New Roman" w:eastAsia="Times New Roman" w:hAnsi="Times New Roman" w:cs="Times New Roman"/>
@@ -655,7 +687,7 @@
           </w:p>
           <w:p>
             <w:pPr>
-              <w:spacing w:after="0"/>
+              <w:spacing w:after="0" w:line="240" w:lineRule="auto"/>
               <w:ind w:left="180" w:firstLine="360"/>
               <w:rPr>
                 <w:rFonts w:ascii="Times New Roman" w:eastAsia="Times New Roman" w:hAnsi="Times New Roman" w:cs="Times New Roman"/>
@@ -935,13 +967,13 @@
         <mc:AlternateContent>
           <mc:Choice Requires="wps">
             <w:drawing>
-              <wp:anchor distT="0" distB="0" distL="114300" distR="114300" simplePos="0" relativeHeight="251657728" behindDoc="0" locked="0" layoutInCell="1" allowOverlap="1" wp14:anchorId="6DCBF019" wp14:editId="64FD4EE3">
+              <wp:anchor distT="0" distB="0" distL="114300" distR="114300" simplePos="0" relativeHeight="251657728" behindDoc="0" locked="0" layoutInCell="1" allowOverlap="1" wp14:anchorId="6DCBF019" wp14:editId="62F7D4DF">
                 <wp:simplePos x="0" y="0"/>
                 <wp:positionH relativeFrom="column">
-                  <wp:posOffset>2804160</wp:posOffset>
+                  <wp:posOffset>3088832</wp:posOffset>
                 </wp:positionH>
                 <wp:positionV relativeFrom="paragraph">
-                  <wp:posOffset>45246</wp:posOffset>
+                  <wp:posOffset>45085</wp:posOffset>
                 </wp:positionV>
                 <wp:extent cx="716507" cy="204716"/>
                 <wp:effectExtent l="0" t="0" r="26670" b="24130"/>
@@ -997,7 +1029,7 @@
           </mc:Choice>
           <mc:Fallback>
             <w:pict>
-              <v:rect w14:anchorId="35807ADE" id="Rectangle 1" o:spid="_x0000_s1026" style="position:absolute;margin-left:220.8pt;margin-top:3.55pt;width:56.4pt;height:16.1pt;z-index:251657728;visibility:visible;mso-wrap-style:square;mso-wrap-distance-left:9pt;mso-wrap-distance-top:0;mso-wrap-distance-right:9pt;mso-wrap-distance-bottom:0;mso-position-horizontal:absolute;mso-position-horizontal-relative:text;mso-position-vertical:absolute;mso-position-vertical-relative:text;v-text-anchor:middle" o:gfxdata="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" filled="f" strokecolor="black [3213]" strokeweight=".25pt"/>
+              <v:rect w14:anchorId="0C97BB74" id="Rectangle 1" o:spid="_x0000_s1026" style="position:absolute;margin-left:243.2pt;margin-top:3.55pt;width:56.4pt;height:16.1pt;z-index:251657728;visibility:visible;mso-wrap-style:square;mso-wrap-distance-left:9pt;mso-wrap-distance-top:0;mso-wrap-distance-right:9pt;mso-wrap-distance-bottom:0;mso-position-horizontal:absolute;mso-position-horizontal-relative:text;mso-position-vertical:absolute;mso-position-vertical-relative:text;v-text-anchor:middle" o:gfxdata="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" filled="f" strokecolor="black [3213]" strokeweight=".25pt"/>
             </w:pict>
           </mc:Fallback>
         </mc:AlternateContent>
@@ -1008,7 +1040,23 @@
           <w:sz w:val="28"/>
           <w:szCs w:val="28"/>
         </w:rPr>
-        <w:t>There is an apple in the garden.</w:t>
+        <w:t>There is an apple</w:t>
+      </w:r>
+      <w:r>
+        <w:rPr>
+          <w:rFonts w:ascii="Times New Roman" w:hAnsi="Times New Roman" w:cs="Times New Roman"/>
+          <w:sz w:val="28"/>
+          <w:szCs w:val="28"/>
+        </w:rPr>
+        <w:t xml:space="preserve"> tree</w:t>
+      </w:r>
+      <w:r>
+        <w:rPr>
+          <w:rFonts w:ascii="Times New Roman" w:hAnsi="Times New Roman" w:cs="Times New Roman"/>
+          <w:sz w:val="28"/>
+          <w:szCs w:val="28"/>
+        </w:rPr>
+        <w:t xml:space="preserve"> in the garden.</w:t>
       </w:r>
     </w:p>
     <w:p>
@@ -1099,7 +1147,7 @@
           </mc:Choice>
           <mc:Fallback>
             <w:pict>
-              <v:rect w14:anchorId="0E191EAC" id="Rectangle 1" o:spid="_x0000_s1026" style="position:absolute;margin-left:167.75pt;margin-top:3.35pt;width:56.4pt;height:16.1pt;z-index:251659776;visibility:visible;mso-wrap-style:square;mso-wrap-distance-left:9pt;mso-wrap-distance-top:0;mso-wrap-distance-right:9pt;mso-wrap-distance-bottom:0;mso-position-horizontal:absolute;mso-position-horizontal-relative:text;mso-position-vertical:absolute;mso-position-vertical-relative:text;v-text-anchor:middle" o:gfxdata="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" filled="f" strokecolor="black [3213]" strokeweight=".25pt"/>
+              <v:rect w14:anchorId="5CC2DF09" id="Rectangle 1" o:spid="_x0000_s1026" style="position:absolute;margin-left:167.75pt;margin-top:3.35pt;width:56.4pt;height:16.1pt;z-index:251659776;visibility:visible;mso-wrap-style:square;mso-wrap-distance-left:9pt;mso-wrap-distance-top:0;mso-wrap-distance-right:9pt;mso-wrap-distance-bottom:0;mso-position-horizontal:absolute;mso-position-horizontal-relative:text;mso-position-vertical:absolute;mso-position-vertical-relative:text;v-text-anchor:middle" o:gfxdata="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" filled="f" strokecolor="black [3213]" strokeweight=".25pt"/>
             </w:pict>
           </mc:Fallback>
         </mc:AlternateContent>
@@ -1201,7 +1249,7 @@
           </mc:Choice>
           <mc:Fallback>
             <w:pict>
-              <v:rect w14:anchorId="0F42B1ED" id="Rectangle 1" o:spid="_x0000_s1026" style="position:absolute;margin-left:153.15pt;margin-top:4.3pt;width:56.4pt;height:16.1pt;z-index:251661824;visibility:visible;mso-wrap-style:square;mso-wrap-distance-left:9pt;mso-wrap-distance-top:0;mso-wrap-distance-right:9pt;mso-wrap-distance-bottom:0;mso-position-horizontal:absolute;mso-position-horizontal-relative:text;mso-position-vertical:absolute;mso-position-vertical-relative:text;v-text-anchor:middle" o:gfxdata="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" filled="f" strokecolor="black [3213]" strokeweight=".25pt"/>
+              <v:rect w14:anchorId="7F8862A6" id="Rectangle 1" o:spid="_x0000_s1026" style="position:absolute;margin-left:153.15pt;margin-top:4.3pt;width:56.4pt;height:16.1pt;z-index:251661824;visibility:visible;mso-wrap-style:square;mso-wrap-distance-left:9pt;mso-wrap-distance-top:0;mso-wrap-distance-right:9pt;mso-wrap-distance-bottom:0;mso-position-horizontal:absolute;mso-position-horizontal-relative:text;mso-position-vertical:absolute;mso-position-vertical-relative:text;v-text-anchor:middle" o:gfxdata="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" filled="f" strokecolor="black [3213]" strokeweight=".25pt"/>
             </w:pict>
           </mc:Fallback>
         </mc:AlternateContent>
@@ -1475,7 +1523,7 @@
     <w:p>
       <w:pPr>
         <w:suppressLineNumbers/>
-        <w:spacing w:after="0"/>
+        <w:spacing w:after="0" w:line="240" w:lineRule="auto"/>
         <w:ind w:left="105"/>
         <w:rPr>
           <w:rFonts w:ascii="Times New Roman" w:hAnsi="Times New Roman" w:cs="Times New Roman"/>
@@ -1559,7 +1607,7 @@
     <w:p>
       <w:pPr>
         <w:suppressLineNumbers/>
-        <w:spacing w:after="0"/>
+        <w:spacing w:after="0" w:line="360" w:lineRule="auto"/>
         <w:ind w:left="105"/>
         <w:rPr>
           <w:rFonts w:ascii="Times New Roman" w:hAnsi="Times New Roman" w:cs="Times New Roman"/>
@@ -1600,7 +1648,7 @@
           <w:numId w:val="2"/>
         </w:numPr>
         <w:suppressLineNumbers/>
-        <w:spacing w:after="0"/>
+        <w:spacing w:after="0" w:line="360" w:lineRule="auto"/>
         <w:rPr>
           <w:rFonts w:ascii="Times New Roman" w:hAnsi="Times New Roman" w:cs="Times New Roman"/>
           <w:sz w:val="28"/>
@@ -1624,20 +1672,70 @@
           <w:numId w:val="2"/>
         </w:numPr>
         <w:suppressLineNumbers/>
-        <w:spacing w:after="0"/>
-        <w:rPr>
-          <w:rFonts w:ascii="Times New Roman" w:hAnsi="Times New Roman" w:cs="Times New Roman"/>
-          <w:sz w:val="28"/>
-          <w:szCs w:val="28"/>
-        </w:rPr>
-      </w:pPr>
-      <w:r>
-        <w:rPr>
-          <w:rFonts w:ascii="Times New Roman" w:hAnsi="Times New Roman" w:cs="Times New Roman"/>
-          <w:sz w:val="28"/>
-          <w:szCs w:val="28"/>
-        </w:rPr>
-        <w:t>Lucky neighbor was an _________ man</w:t>
+        <w:spacing w:after="0" w:line="360" w:lineRule="auto"/>
+        <w:rPr>
+          <w:rFonts w:ascii="Times New Roman" w:hAnsi="Times New Roman" w:cs="Times New Roman"/>
+          <w:sz w:val="28"/>
+          <w:szCs w:val="28"/>
+        </w:rPr>
+      </w:pPr>
+      <w:r>
+        <w:rPr>
+          <w:rFonts w:ascii="Times New Roman" w:hAnsi="Times New Roman" w:cs="Times New Roman"/>
+          <w:sz w:val="28"/>
+          <w:szCs w:val="28"/>
+        </w:rPr>
+        <w:t>Lucky</w:t>
+      </w:r>
+      <w:r>
+        <w:rPr>
+          <w:rFonts w:ascii="Times New Roman" w:hAnsi="Times New Roman" w:cs="Times New Roman"/>
+          <w:sz w:val="28"/>
+          <w:szCs w:val="28"/>
+        </w:rPr>
+        <w:t>’s</w:t>
+      </w:r>
+      <w:r>
+        <w:rPr>
+          <w:rFonts w:ascii="Times New Roman" w:hAnsi="Times New Roman" w:cs="Times New Roman"/>
+          <w:sz w:val="28"/>
+          <w:szCs w:val="28"/>
+        </w:rPr>
+        <w:t xml:space="preserve"> </w:t>
+      </w:r>
+      <w:proofErr w:type="spellStart"/>
+      <w:r>
+        <w:rPr>
+          <w:rFonts w:ascii="Times New Roman" w:hAnsi="Times New Roman" w:cs="Times New Roman"/>
+          <w:sz w:val="28"/>
+          <w:szCs w:val="28"/>
+        </w:rPr>
+        <w:t>neighbo</w:t>
+      </w:r>
+      <w:r>
+        <w:rPr>
+          <w:rFonts w:ascii="Times New Roman" w:hAnsi="Times New Roman" w:cs="Times New Roman"/>
+          <w:sz w:val="28"/>
+          <w:szCs w:val="28"/>
+        </w:rPr>
+        <w:t>u</w:t>
+      </w:r>
+      <w:r>
+        <w:rPr>
+          <w:rFonts w:ascii="Times New Roman" w:hAnsi="Times New Roman" w:cs="Times New Roman"/>
+          <w:sz w:val="28"/>
+          <w:szCs w:val="28"/>
+        </w:rPr>
+        <w:t>r</w:t>
+      </w:r>
+      <w:proofErr w:type="spellEnd"/>
+      <w:r>
+        <w:rPr>
+          <w:rFonts w:ascii="Times New Roman" w:hAnsi="Times New Roman" w:cs="Times New Roman"/>
+          <w:sz w:val="28"/>
+          <w:szCs w:val="28"/>
+        </w:rPr>
+        <w:t xml:space="preserve"> was an _________ man</w:t>
       </w:r>
       <w:r>
         <w:rPr>
@@ -1656,7 +1754,7 @@
           <w:numId w:val="2"/>
         </w:numPr>
         <w:suppressLineNumbers/>
-        <w:spacing w:after="0"/>
+        <w:spacing w:after="0" w:line="360" w:lineRule="auto"/>
         <w:rPr>
           <w:rFonts w:ascii="Times New Roman" w:hAnsi="Times New Roman" w:cs="Times New Roman"/>
           <w:sz w:val="28"/>
@@ -1677,7 +1775,25 @@
           <w:sz w:val="28"/>
           <w:szCs w:val="28"/>
         </w:rPr>
-        <w:t>grandparents __________ in Tanahun.</w:t>
+        <w:t xml:space="preserve">grandparents __________ in </w:t>
+      </w:r>
+      <w:proofErr w:type="spellStart"/>
+      <w:r>
+        <w:rPr>
+          <w:rFonts w:ascii="Times New Roman" w:hAnsi="Times New Roman" w:cs="Times New Roman"/>
+          <w:sz w:val="28"/>
+          <w:szCs w:val="28"/>
+        </w:rPr>
+        <w:t>Tanahun</w:t>
+      </w:r>
+      <w:proofErr w:type="spellEnd"/>
+      <w:r>
+        <w:rPr>
+          <w:rFonts w:ascii="Times New Roman" w:hAnsi="Times New Roman" w:cs="Times New Roman"/>
+          <w:sz w:val="28"/>
+          <w:szCs w:val="28"/>
+        </w:rPr>
+        <w:t>.</w:t>
       </w:r>
     </w:p>
     <w:p>
@@ -1688,7 +1804,7 @@
           <w:numId w:val="2"/>
         </w:numPr>
         <w:suppressLineNumbers/>
-        <w:spacing w:after="0"/>
+        <w:spacing w:after="0" w:line="360" w:lineRule="auto"/>
         <w:rPr>
           <w:rFonts w:ascii="Times New Roman" w:hAnsi="Times New Roman" w:cs="Times New Roman"/>
           <w:sz w:val="28"/>
@@ -1712,21 +1828,31 @@
           <w:numId w:val="2"/>
         </w:numPr>
         <w:suppressLineNumbers/>
-        <w:spacing w:after="0"/>
-        <w:rPr>
-          <w:rFonts w:ascii="Times New Roman" w:hAnsi="Times New Roman" w:cs="Times New Roman"/>
-          <w:sz w:val="28"/>
-          <w:szCs w:val="28"/>
-        </w:rPr>
-      </w:pPr>
-      <w:r>
-        <w:rPr>
-          <w:rFonts w:ascii="Times New Roman" w:hAnsi="Times New Roman" w:cs="Times New Roman"/>
-          <w:sz w:val="28"/>
-          <w:szCs w:val="28"/>
-        </w:rPr>
-        <w:t>Binu and Yam are ________ .</w:t>
-      </w:r>
+        <w:spacing w:after="0" w:line="360" w:lineRule="auto"/>
+        <w:rPr>
+          <w:rFonts w:ascii="Times New Roman" w:hAnsi="Times New Roman" w:cs="Times New Roman"/>
+          <w:sz w:val="28"/>
+          <w:szCs w:val="28"/>
+        </w:rPr>
+      </w:pPr>
+      <w:r>
+        <w:rPr>
+          <w:rFonts w:ascii="Times New Roman" w:hAnsi="Times New Roman" w:cs="Times New Roman"/>
+          <w:sz w:val="28"/>
+          <w:szCs w:val="28"/>
+        </w:rPr>
+        <w:t>Binu and Yam are _______</w:t>
+      </w:r>
+      <w:proofErr w:type="gramStart"/>
+      <w:r>
+        <w:rPr>
+          <w:rFonts w:ascii="Times New Roman" w:hAnsi="Times New Roman" w:cs="Times New Roman"/>
+          <w:sz w:val="28"/>
+          <w:szCs w:val="28"/>
+        </w:rPr>
+        <w:t>_ .</w:t>
+      </w:r>
+      <w:proofErr w:type="gramEnd"/>
     </w:p>
     <w:p>
       <w:pPr>
@@ -2371,6 +2497,54 @@
         </w:rPr>
         <w:t xml:space="preserve"> _______________</w:t>
       </w:r>
+      <w:r>
+        <w:rPr>
+          <w:rFonts w:ascii="Times New Roman" w:hAnsi="Times New Roman" w:cs="Times New Roman"/>
+          <w:sz w:val="28"/>
+          <w:szCs w:val="28"/>
+        </w:rPr>
+        <w:tab/>
+      </w:r>
+      <w:r>
+        <w:rPr>
+          <w:rFonts w:ascii="Times New Roman" w:hAnsi="Times New Roman" w:cs="Times New Roman"/>
+          <w:sz w:val="28"/>
+          <w:szCs w:val="28"/>
+        </w:rPr>
+        <w:t xml:space="preserve">            </w:t>
+      </w:r>
+      <w:r>
+        <w:rPr>
+          <w:rFonts w:ascii="Times New Roman" w:hAnsi="Times New Roman" w:cs="Times New Roman"/>
+          <w:sz w:val="28"/>
+          <w:szCs w:val="28"/>
+        </w:rPr>
+        <w:t>Big</w:t>
+      </w:r>
+      <w:r>
+        <w:rPr>
+          <w:rFonts w:ascii="Times New Roman" w:hAnsi="Times New Roman" w:cs="Times New Roman"/>
+          <w:sz w:val="28"/>
+          <w:szCs w:val="28"/>
+        </w:rPr>
+        <w:t xml:space="preserve"> </w:t>
+      </w:r>
+      <w:r>
+        <w:rPr>
+          <w:rFonts w:ascii="Times New Roman" w:hAnsi="Times New Roman" w:cs="Times New Roman"/>
+          <w:sz w:val="28"/>
+          <w:szCs w:val="28"/>
+        </w:rPr>
+        <w:t>-</w:t>
+      </w:r>
+      <w:r>
+        <w:rPr>
+          <w:rFonts w:ascii="Times New Roman" w:hAnsi="Times New Roman" w:cs="Times New Roman"/>
+          <w:sz w:val="28"/>
+          <w:szCs w:val="28"/>
+        </w:rPr>
+        <w:t xml:space="preserve"> _______________</w:t>
+      </w:r>
     </w:p>
     <w:p>
       <w:pPr>
@@ -2396,7 +2570,7 @@
           <w:sz w:val="28"/>
           <w:szCs w:val="28"/>
         </w:rPr>
-        <w:t>Big</w:t>
+        <w:t>Friendly</w:t>
       </w:r>
       <w:r>
         <w:rPr>
@@ -2421,6 +2595,390 @@
           <w:szCs w:val="28"/>
         </w:rPr>
         <w:t xml:space="preserve"> _______________</w:t>
+      </w:r>
+      <w:r>
+        <w:rPr>
+          <w:rFonts w:ascii="Times New Roman" w:hAnsi="Times New Roman" w:cs="Times New Roman"/>
+          <w:sz w:val="28"/>
+          <w:szCs w:val="28"/>
+        </w:rPr>
+        <w:tab/>
+      </w:r>
+      <w:r>
+        <w:rPr>
+          <w:rFonts w:ascii="Times New Roman" w:hAnsi="Times New Roman" w:cs="Times New Roman"/>
+          <w:sz w:val="28"/>
+          <w:szCs w:val="28"/>
+        </w:rPr>
+        <w:t xml:space="preserve">            </w:t>
+      </w:r>
+      <w:r>
+        <w:rPr>
+          <w:rFonts w:ascii="Times New Roman" w:hAnsi="Times New Roman" w:cs="Times New Roman"/>
+          <w:sz w:val="28"/>
+          <w:szCs w:val="28"/>
+        </w:rPr>
+        <w:t>Comfortable</w:t>
+      </w:r>
+      <w:r>
+        <w:rPr>
+          <w:rFonts w:ascii="Times New Roman" w:hAnsi="Times New Roman" w:cs="Times New Roman"/>
+          <w:sz w:val="28"/>
+          <w:szCs w:val="28"/>
+        </w:rPr>
+        <w:t xml:space="preserve"> </w:t>
+      </w:r>
+      <w:r>
+        <w:rPr>
+          <w:rFonts w:ascii="Times New Roman" w:hAnsi="Times New Roman" w:cs="Times New Roman"/>
+          <w:sz w:val="28"/>
+          <w:szCs w:val="28"/>
+        </w:rPr>
+        <w:t>-</w:t>
+      </w:r>
+      <w:r>
+        <w:rPr>
+          <w:rFonts w:ascii="Times New Roman" w:hAnsi="Times New Roman" w:cs="Times New Roman"/>
+          <w:sz w:val="28"/>
+          <w:szCs w:val="28"/>
+        </w:rPr>
+        <w:t xml:space="preserve"> _______________</w:t>
+      </w:r>
+    </w:p>
+    <w:p>
+      <w:pPr>
+        <w:suppressLineNumbers/>
+        <w:spacing w:after="0" w:line="240" w:lineRule="auto"/>
+        <w:rPr>
+          <w:rFonts w:ascii="Times New Roman" w:hAnsi="Times New Roman" w:cs="Times New Roman"/>
+          <w:b/>
+          <w:bCs/>
+          <w:sz w:val="28"/>
+          <w:szCs w:val="28"/>
+        </w:rPr>
+      </w:pPr>
+      <w:r>
+        <w:rPr>
+          <w:rFonts w:ascii="Times New Roman" w:hAnsi="Times New Roman" w:cs="Times New Roman"/>
+          <w:b/>
+          <w:bCs/>
+          <w:sz w:val="28"/>
+          <w:szCs w:val="28"/>
+        </w:rPr>
+        <w:t>Q.no 5. Match the following</w:t>
+      </w:r>
+      <w:r>
+        <w:rPr>
+          <w:rFonts w:ascii="Times New Roman" w:hAnsi="Times New Roman" w:cs="Times New Roman"/>
+          <w:b/>
+          <w:bCs/>
+          <w:sz w:val="28"/>
+          <w:szCs w:val="28"/>
+        </w:rPr>
+        <w:t xml:space="preserve"> words with their meaning</w:t>
+      </w:r>
+      <w:r>
+        <w:rPr>
+          <w:rFonts w:ascii="Times New Roman" w:hAnsi="Times New Roman" w:cs="Times New Roman"/>
+          <w:b/>
+          <w:bCs/>
+          <w:sz w:val="28"/>
+          <w:szCs w:val="28"/>
+        </w:rPr>
+        <w:t xml:space="preserve">.     </w:t>
+      </w:r>
+      <w:r>
+        <w:rPr>
+          <w:rFonts w:ascii="Times New Roman" w:hAnsi="Times New Roman" w:cs="Times New Roman"/>
+          <w:b/>
+          <w:bCs/>
+          <w:sz w:val="28"/>
+          <w:szCs w:val="28"/>
+        </w:rPr>
+        <w:t xml:space="preserve">       </w:t>
+      </w:r>
+      <w:r>
+        <w:rPr>
+          <w:rFonts w:ascii="Times New Roman" w:hAnsi="Times New Roman" w:cs="Times New Roman"/>
+          <w:b/>
+          <w:bCs/>
+          <w:sz w:val="28"/>
+          <w:szCs w:val="28"/>
+        </w:rPr>
+        <w:t xml:space="preserve">     </w:t>
+      </w:r>
+      <w:r>
+        <w:rPr>
+          <w:rFonts w:ascii="Times New Roman" w:hAnsi="Times New Roman" w:cs="Times New Roman"/>
+          <w:b/>
+          <w:bCs/>
+          <w:sz w:val="28"/>
+          <w:szCs w:val="28"/>
+        </w:rPr>
+        <w:t xml:space="preserve">     </w:t>
+      </w:r>
+      <w:r>
+        <w:rPr>
+          <w:rFonts w:ascii="Times New Roman" w:hAnsi="Times New Roman" w:cs="Times New Roman"/>
+          <w:b/>
+          <w:bCs/>
+          <w:sz w:val="28"/>
+          <w:szCs w:val="28"/>
+        </w:rPr>
+        <w:tab/>
+      </w:r>
+      <w:r>
+        <w:rPr>
+          <w:rFonts w:ascii="Times New Roman" w:hAnsi="Times New Roman" w:cs="Times New Roman"/>
+          <w:b/>
+          <w:bCs/>
+          <w:sz w:val="28"/>
+          <w:szCs w:val="28"/>
+        </w:rPr>
+        <w:tab/>
+      </w:r>
+      <w:r>
+        <w:rPr>
+          <w:rFonts w:ascii="Times New Roman" w:hAnsi="Times New Roman" w:cs="Times New Roman"/>
+          <w:b/>
+          <w:bCs/>
+          <w:sz w:val="28"/>
+          <w:szCs w:val="28"/>
+        </w:rPr>
+        <w:t>[5]</w:t>
+      </w:r>
+    </w:p>
+    <w:p>
+      <w:pPr>
+        <w:suppressLineNumbers/>
+        <w:spacing w:after="0" w:line="240" w:lineRule="auto"/>
+        <w:rPr>
+          <w:rFonts w:ascii="Times New Roman" w:hAnsi="Times New Roman" w:cs="Times New Roman"/>
+          <w:sz w:val="28"/>
+          <w:szCs w:val="28"/>
+        </w:rPr>
+      </w:pPr>
+      <w:r>
+        <w:rPr>
+          <w:rFonts w:ascii="Times New Roman" w:hAnsi="Times New Roman" w:cs="Times New Roman"/>
+          <w:sz w:val="28"/>
+          <w:szCs w:val="28"/>
+        </w:rPr>
+        <w:t xml:space="preserve">           Kids</w:t>
+      </w:r>
+      <w:r>
+        <w:rPr>
+          <w:rFonts w:ascii="Times New Roman" w:hAnsi="Times New Roman" w:cs="Times New Roman"/>
+          <w:sz w:val="28"/>
+          <w:szCs w:val="28"/>
+        </w:rPr>
+        <w:t xml:space="preserve">                                         </w:t>
+      </w:r>
+      <w:r>
+        <w:rPr>
+          <w:rFonts w:ascii="Times New Roman" w:hAnsi="Times New Roman" w:cs="Times New Roman"/>
+          <w:sz w:val="28"/>
+          <w:szCs w:val="28"/>
+        </w:rPr>
+        <w:tab/>
+      </w:r>
+      <w:r>
+        <w:rPr>
+          <w:rFonts w:ascii="Times New Roman" w:hAnsi="Times New Roman" w:cs="Times New Roman"/>
+          <w:sz w:val="28"/>
+          <w:szCs w:val="28"/>
+        </w:rPr>
+        <w:t>what we prefer</w:t>
+      </w:r>
+    </w:p>
+    <w:p>
+      <w:pPr>
+        <w:suppressLineNumbers/>
+        <w:spacing w:after="0" w:line="240" w:lineRule="auto"/>
+        <w:rPr>
+          <w:rFonts w:ascii="Times New Roman" w:hAnsi="Times New Roman" w:cs="Times New Roman"/>
+          <w:sz w:val="28"/>
+          <w:szCs w:val="28"/>
+        </w:rPr>
+      </w:pPr>
+      <w:r>
+        <w:rPr>
+          <w:rFonts w:ascii="Times New Roman" w:hAnsi="Times New Roman" w:cs="Times New Roman"/>
+          <w:sz w:val="28"/>
+          <w:szCs w:val="28"/>
+        </w:rPr>
+        <w:t xml:space="preserve">           </w:t>
+      </w:r>
+      <w:proofErr w:type="spellStart"/>
+      <w:r>
+        <w:rPr>
+          <w:rFonts w:ascii="Times New Roman" w:hAnsi="Times New Roman" w:cs="Times New Roman"/>
+          <w:sz w:val="28"/>
+          <w:szCs w:val="28"/>
+        </w:rPr>
+        <w:t>Favourite</w:t>
+      </w:r>
+      <w:proofErr w:type="spellEnd"/>
+      <w:r>
+        <w:rPr>
+          <w:rFonts w:ascii="Times New Roman" w:hAnsi="Times New Roman" w:cs="Times New Roman"/>
+          <w:sz w:val="28"/>
+          <w:szCs w:val="28"/>
+        </w:rPr>
+        <w:t xml:space="preserve">                                  </w:t>
+      </w:r>
+      <w:r>
+        <w:rPr>
+          <w:rFonts w:ascii="Times New Roman" w:hAnsi="Times New Roman" w:cs="Times New Roman"/>
+          <w:sz w:val="28"/>
+          <w:szCs w:val="28"/>
+        </w:rPr>
+        <w:tab/>
+      </w:r>
+      <w:r>
+        <w:rPr>
+          <w:rFonts w:ascii="Times New Roman" w:hAnsi="Times New Roman" w:cs="Times New Roman"/>
+          <w:sz w:val="28"/>
+          <w:szCs w:val="28"/>
+        </w:rPr>
+        <w:t>full of juice</w:t>
+      </w:r>
+    </w:p>
+    <w:p>
+      <w:pPr>
+        <w:suppressLineNumbers/>
+        <w:spacing w:after="0" w:line="240" w:lineRule="auto"/>
+        <w:rPr>
+          <w:rFonts w:ascii="Times New Roman" w:hAnsi="Times New Roman" w:cs="Times New Roman"/>
+          <w:sz w:val="28"/>
+          <w:szCs w:val="28"/>
+        </w:rPr>
+      </w:pPr>
+      <w:r>
+        <w:rPr>
+          <w:rFonts w:ascii="Times New Roman" w:hAnsi="Times New Roman" w:cs="Times New Roman"/>
+          <w:sz w:val="28"/>
+          <w:szCs w:val="28"/>
+        </w:rPr>
+        <w:t xml:space="preserve">         </w:t>
+      </w:r>
+      <w:r>
+        <w:rPr>
+          <w:rFonts w:ascii="Times New Roman" w:hAnsi="Times New Roman" w:cs="Times New Roman"/>
+          <w:sz w:val="28"/>
+          <w:szCs w:val="28"/>
+        </w:rPr>
+        <w:t xml:space="preserve"> </w:t>
+      </w:r>
+      <w:r>
+        <w:rPr>
+          <w:rFonts w:ascii="Times New Roman" w:hAnsi="Times New Roman" w:cs="Times New Roman"/>
+          <w:sz w:val="28"/>
+          <w:szCs w:val="28"/>
+        </w:rPr>
+        <w:t>Juicy</w:t>
+      </w:r>
+      <w:r>
+        <w:rPr>
+          <w:rFonts w:ascii="Times New Roman" w:hAnsi="Times New Roman" w:cs="Times New Roman"/>
+          <w:sz w:val="28"/>
+          <w:szCs w:val="28"/>
+        </w:rPr>
+        <w:t xml:space="preserve">                                         </w:t>
+      </w:r>
+      <w:r>
+        <w:rPr>
+          <w:rFonts w:ascii="Times New Roman" w:hAnsi="Times New Roman" w:cs="Times New Roman"/>
+          <w:sz w:val="28"/>
+          <w:szCs w:val="28"/>
+        </w:rPr>
+        <w:tab/>
+      </w:r>
+      <w:r>
+        <w:rPr>
+          <w:rFonts w:ascii="Times New Roman" w:hAnsi="Times New Roman" w:cs="Times New Roman"/>
+          <w:sz w:val="28"/>
+          <w:szCs w:val="28"/>
+        </w:rPr>
+        <w:t>market</w:t>
+      </w:r>
+    </w:p>
+    <w:p>
+      <w:pPr>
+        <w:suppressLineNumbers/>
+        <w:spacing w:after="0" w:line="240" w:lineRule="auto"/>
+        <w:rPr>
+          <w:rFonts w:ascii="Times New Roman" w:hAnsi="Times New Roman" w:cs="Times New Roman"/>
+          <w:sz w:val="28"/>
+          <w:szCs w:val="28"/>
+        </w:rPr>
+      </w:pPr>
+      <w:r>
+        <w:rPr>
+          <w:rFonts w:ascii="Times New Roman" w:hAnsi="Times New Roman" w:cs="Times New Roman"/>
+          <w:sz w:val="28"/>
+          <w:szCs w:val="28"/>
+        </w:rPr>
+        <w:t xml:space="preserve">          Bazaar</w:t>
+      </w:r>
+      <w:r>
+        <w:rPr>
+          <w:rFonts w:ascii="Times New Roman" w:hAnsi="Times New Roman" w:cs="Times New Roman"/>
+          <w:sz w:val="28"/>
+          <w:szCs w:val="28"/>
+        </w:rPr>
+        <w:t xml:space="preserve">                                       </w:t>
+      </w:r>
+      <w:r>
+        <w:rPr>
+          <w:rFonts w:ascii="Times New Roman" w:hAnsi="Times New Roman" w:cs="Times New Roman"/>
+          <w:sz w:val="28"/>
+          <w:szCs w:val="28"/>
+        </w:rPr>
+        <w:tab/>
+      </w:r>
+      <w:r>
+        <w:rPr>
+          <w:rFonts w:ascii="Times New Roman" w:hAnsi="Times New Roman" w:cs="Times New Roman"/>
+          <w:sz w:val="28"/>
+          <w:szCs w:val="28"/>
+        </w:rPr>
+        <w:t>fruit and vegetable shop</w:t>
+      </w:r>
+    </w:p>
+    <w:p>
+      <w:pPr>
+        <w:suppressLineNumbers/>
+        <w:spacing w:after="0" w:line="240" w:lineRule="auto"/>
+        <w:rPr>
+          <w:rFonts w:ascii="Times New Roman" w:hAnsi="Times New Roman" w:cs="Times New Roman"/>
+          <w:sz w:val="28"/>
+          <w:szCs w:val="28"/>
+        </w:rPr>
+      </w:pPr>
+      <w:r>
+        <w:rPr>
+          <w:rFonts w:ascii="Times New Roman" w:hAnsi="Times New Roman" w:cs="Times New Roman"/>
+          <w:sz w:val="28"/>
+          <w:szCs w:val="28"/>
+        </w:rPr>
+        <w:t xml:space="preserve">          Green                                        </w:t>
+      </w:r>
+      <w:r>
+        <w:rPr>
+          <w:rFonts w:ascii="Times New Roman" w:hAnsi="Times New Roman" w:cs="Times New Roman"/>
+          <w:sz w:val="28"/>
+          <w:szCs w:val="28"/>
+        </w:rPr>
+        <w:tab/>
+      </w:r>
+      <w:r>
+        <w:rPr>
+          <w:rFonts w:ascii="Times New Roman" w:hAnsi="Times New Roman" w:cs="Times New Roman"/>
+          <w:sz w:val="28"/>
+          <w:szCs w:val="28"/>
+        </w:rPr>
+        <w:t>children</w:t>
       </w:r>
     </w:p>
     <w:p>
@@ -2429,50 +2987,12 @@
         <w:spacing w:after="0"/>
         <w:rPr>
           <w:rFonts w:ascii="Times New Roman" w:hAnsi="Times New Roman" w:cs="Times New Roman"/>
-          <w:sz w:val="28"/>
-          <w:szCs w:val="28"/>
-        </w:rPr>
-      </w:pPr>
-      <w:r>
-        <w:rPr>
-          <w:rFonts w:ascii="Times New Roman" w:hAnsi="Times New Roman" w:cs="Times New Roman"/>
-          <w:sz w:val="28"/>
-          <w:szCs w:val="28"/>
-        </w:rPr>
-        <w:t xml:space="preserve">            </w:t>
-      </w:r>
-      <w:r>
-        <w:rPr>
-          <w:rFonts w:ascii="Times New Roman" w:hAnsi="Times New Roman" w:cs="Times New Roman"/>
-          <w:sz w:val="28"/>
-          <w:szCs w:val="28"/>
-        </w:rPr>
-        <w:t>Friendly</w:t>
-      </w:r>
-      <w:r>
-        <w:rPr>
-          <w:rFonts w:ascii="Times New Roman" w:hAnsi="Times New Roman" w:cs="Times New Roman"/>
-          <w:sz w:val="28"/>
-          <w:szCs w:val="28"/>
-        </w:rPr>
-        <w:t xml:space="preserve"> </w:t>
-      </w:r>
-      <w:r>
-        <w:rPr>
-          <w:rFonts w:ascii="Times New Roman" w:hAnsi="Times New Roman" w:cs="Times New Roman"/>
-          <w:sz w:val="28"/>
-          <w:szCs w:val="28"/>
-        </w:rPr>
-        <w:t>-</w:t>
-      </w:r>
-      <w:r>
-        <w:rPr>
-          <w:rFonts w:ascii="Times New Roman" w:hAnsi="Times New Roman" w:cs="Times New Roman"/>
-          <w:sz w:val="28"/>
-          <w:szCs w:val="28"/>
-        </w:rPr>
-        <w:t xml:space="preserve"> _______________</w:t>
-      </w:r>
+          <w:b/>
+          <w:bCs/>
+          <w:sz w:val="28"/>
+          <w:szCs w:val="28"/>
+        </w:rPr>
+      </w:pPr>
     </w:p>
     <w:p>
       <w:pPr>
@@ -2480,6 +3000,90 @@
         <w:spacing w:after="0"/>
         <w:rPr>
           <w:rFonts w:ascii="Times New Roman" w:hAnsi="Times New Roman" w:cs="Times New Roman"/>
+          <w:b/>
+          <w:bCs/>
+          <w:sz w:val="28"/>
+          <w:szCs w:val="28"/>
+        </w:rPr>
+      </w:pPr>
+      <w:r>
+        <w:rPr>
+          <w:rFonts w:ascii="Times New Roman" w:hAnsi="Times New Roman" w:cs="Times New Roman"/>
+          <w:b/>
+          <w:bCs/>
+          <w:sz w:val="28"/>
+          <w:szCs w:val="28"/>
+        </w:rPr>
+        <w:lastRenderedPageBreak/>
+        <w:t>Q.no 6. Make sent</w:t>
+      </w:r>
+      <w:r>
+        <w:rPr>
+          <w:rFonts w:ascii="Times New Roman" w:hAnsi="Times New Roman" w:cs="Times New Roman"/>
+          <w:b/>
+          <w:bCs/>
+          <w:sz w:val="28"/>
+          <w:szCs w:val="28"/>
+        </w:rPr>
+        <w:t>ences by using following words.</w:t>
+      </w:r>
+      <w:r>
+        <w:rPr>
+          <w:rFonts w:ascii="Times New Roman" w:hAnsi="Times New Roman" w:cs="Times New Roman"/>
+          <w:b/>
+          <w:bCs/>
+          <w:sz w:val="28"/>
+          <w:szCs w:val="28"/>
+        </w:rPr>
+        <w:t xml:space="preserve">                            </w:t>
+      </w:r>
+      <w:r>
+        <w:rPr>
+          <w:rFonts w:ascii="Times New Roman" w:hAnsi="Times New Roman" w:cs="Times New Roman"/>
+          <w:b/>
+          <w:bCs/>
+          <w:sz w:val="28"/>
+          <w:szCs w:val="28"/>
+        </w:rPr>
+        <w:t xml:space="preserve">    </w:t>
+      </w:r>
+      <w:r>
+        <w:rPr>
+          <w:rFonts w:ascii="Times New Roman" w:hAnsi="Times New Roman" w:cs="Times New Roman"/>
+          <w:b/>
+          <w:bCs/>
+          <w:sz w:val="28"/>
+          <w:szCs w:val="28"/>
+        </w:rPr>
+        <w:tab/>
+      </w:r>
+      <w:r>
+        <w:rPr>
+          <w:rFonts w:ascii="Times New Roman" w:hAnsi="Times New Roman" w:cs="Times New Roman"/>
+          <w:b/>
+          <w:bCs/>
+          <w:sz w:val="28"/>
+          <w:szCs w:val="28"/>
+        </w:rPr>
+        <w:tab/>
+      </w:r>
+      <w:r>
+        <w:rPr>
+          <w:rFonts w:ascii="Times New Roman" w:hAnsi="Times New Roman" w:cs="Times New Roman"/>
+          <w:b/>
+          <w:bCs/>
+          <w:sz w:val="28"/>
+          <w:szCs w:val="28"/>
+        </w:rPr>
+        <w:t>[4]</w:t>
+      </w:r>
+    </w:p>
+    <w:p>
+      <w:pPr>
+        <w:suppressLineNumbers/>
+        <w:spacing w:after="0"/>
+        <w:rPr>
+          <w:rFonts w:ascii="Times New Roman" w:hAnsi="Times New Roman" w:cs="Times New Roman"/>
           <w:sz w:val="28"/>
           <w:szCs w:val="28"/>
         </w:rPr>
@@ -2498,14 +3102,6 @@
           <w:sz w:val="28"/>
           <w:szCs w:val="28"/>
         </w:rPr>
-        <w:t>Comfortable</w:t>
-      </w:r>
-      <w:r>
-        <w:rPr>
-          <w:rFonts w:ascii="Times New Roman" w:hAnsi="Times New Roman" w:cs="Times New Roman"/>
-          <w:sz w:val="28"/>
-          <w:szCs w:val="28"/>
-        </w:rPr>
         <w:t xml:space="preserve"> </w:t>
       </w:r>
       <w:r>
@@ -2514,15 +3110,422 @@
           <w:sz w:val="28"/>
           <w:szCs w:val="28"/>
         </w:rPr>
-        <w:t>-</w:t>
-      </w:r>
-      <w:r>
-        <w:rPr>
-          <w:rFonts w:ascii="Times New Roman" w:hAnsi="Times New Roman" w:cs="Times New Roman"/>
-          <w:sz w:val="28"/>
-          <w:szCs w:val="28"/>
-        </w:rPr>
-        <w:t xml:space="preserve"> _______________</w:t>
+        <w:t>Fly</w:t>
+      </w:r>
+      <w:r>
+        <w:rPr>
+          <w:rFonts w:ascii="Times New Roman" w:hAnsi="Times New Roman" w:cs="Times New Roman"/>
+          <w:sz w:val="28"/>
+          <w:szCs w:val="28"/>
+        </w:rPr>
+        <w:t xml:space="preserve"> -</w:t>
+      </w:r>
+      <w:r>
+        <w:rPr>
+          <w:rFonts w:ascii="Times New Roman" w:hAnsi="Times New Roman" w:cs="Times New Roman"/>
+          <w:sz w:val="28"/>
+          <w:szCs w:val="28"/>
+        </w:rPr>
+        <w:t xml:space="preserve"> </w:t>
+      </w:r>
+      <w:r>
+        <w:rPr>
+          <w:rFonts w:ascii="Times New Roman" w:hAnsi="Times New Roman" w:cs="Times New Roman"/>
+          <w:sz w:val="28"/>
+          <w:szCs w:val="28"/>
+        </w:rPr>
+        <w:t>_________________________________</w:t>
+      </w:r>
+      <w:r>
+        <w:rPr>
+          <w:rFonts w:ascii="Times New Roman" w:hAnsi="Times New Roman" w:cs="Times New Roman"/>
+          <w:sz w:val="28"/>
+          <w:szCs w:val="28"/>
+        </w:rPr>
+        <w:t>___________</w:t>
+      </w:r>
+      <w:r>
+        <w:rPr>
+          <w:rFonts w:ascii="Times New Roman" w:hAnsi="Times New Roman" w:cs="Times New Roman"/>
+          <w:sz w:val="28"/>
+          <w:szCs w:val="28"/>
+        </w:rPr>
+        <w:t>___________________</w:t>
+      </w:r>
+    </w:p>
+    <w:p>
+      <w:pPr>
+        <w:suppressLineNumbers/>
+        <w:spacing w:after="0"/>
+        <w:rPr>
+          <w:rFonts w:ascii="Times New Roman" w:hAnsi="Times New Roman" w:cs="Times New Roman"/>
+          <w:sz w:val="28"/>
+          <w:szCs w:val="28"/>
+        </w:rPr>
+      </w:pPr>
+      <w:r>
+        <w:rPr>
+          <w:rFonts w:ascii="Times New Roman" w:hAnsi="Times New Roman" w:cs="Times New Roman"/>
+          <w:sz w:val="28"/>
+          <w:szCs w:val="28"/>
+        </w:rPr>
+        <w:t xml:space="preserve">           </w:t>
+      </w:r>
+      <w:r>
+        <w:rPr>
+          <w:rFonts w:ascii="Times New Roman" w:hAnsi="Times New Roman" w:cs="Times New Roman"/>
+          <w:sz w:val="28"/>
+          <w:szCs w:val="28"/>
+        </w:rPr>
+        <w:t xml:space="preserve">  </w:t>
+      </w:r>
+      <w:r>
+        <w:rPr>
+          <w:rFonts w:ascii="Times New Roman" w:hAnsi="Times New Roman" w:cs="Times New Roman"/>
+          <w:sz w:val="28"/>
+          <w:szCs w:val="28"/>
+        </w:rPr>
+        <w:t>Forest</w:t>
+      </w:r>
+      <w:r>
+        <w:rPr>
+          <w:rFonts w:ascii="Times New Roman" w:hAnsi="Times New Roman" w:cs="Times New Roman"/>
+          <w:sz w:val="28"/>
+          <w:szCs w:val="28"/>
+        </w:rPr>
+        <w:t xml:space="preserve"> -</w:t>
+      </w:r>
+      <w:r>
+        <w:rPr>
+          <w:rFonts w:ascii="Times New Roman" w:hAnsi="Times New Roman" w:cs="Times New Roman"/>
+          <w:sz w:val="28"/>
+          <w:szCs w:val="28"/>
+        </w:rPr>
+        <w:t xml:space="preserve"> </w:t>
+      </w:r>
+      <w:r>
+        <w:rPr>
+          <w:rFonts w:ascii="Times New Roman" w:hAnsi="Times New Roman" w:cs="Times New Roman"/>
+          <w:sz w:val="28"/>
+          <w:szCs w:val="28"/>
+        </w:rPr>
+        <w:t>_________________________________</w:t>
+      </w:r>
+      <w:r>
+        <w:rPr>
+          <w:rFonts w:ascii="Times New Roman" w:hAnsi="Times New Roman" w:cs="Times New Roman"/>
+          <w:sz w:val="28"/>
+          <w:szCs w:val="28"/>
+        </w:rPr>
+        <w:t>___________</w:t>
+      </w:r>
+      <w:r>
+        <w:rPr>
+          <w:rFonts w:ascii="Times New Roman" w:hAnsi="Times New Roman" w:cs="Times New Roman"/>
+          <w:sz w:val="28"/>
+          <w:szCs w:val="28"/>
+        </w:rPr>
+        <w:t>_________________</w:t>
+      </w:r>
+    </w:p>
+    <w:p>
+      <w:pPr>
+        <w:suppressLineNumbers/>
+        <w:spacing w:after="0"/>
+        <w:rPr>
+          <w:rFonts w:ascii="Times New Roman" w:hAnsi="Times New Roman" w:cs="Times New Roman"/>
+          <w:sz w:val="28"/>
+          <w:szCs w:val="28"/>
+        </w:rPr>
+      </w:pPr>
+      <w:r>
+        <w:rPr>
+          <w:rFonts w:ascii="Times New Roman" w:hAnsi="Times New Roman" w:cs="Times New Roman"/>
+          <w:sz w:val="28"/>
+          <w:szCs w:val="28"/>
+        </w:rPr>
+        <w:t xml:space="preserve">           </w:t>
+      </w:r>
+      <w:r>
+        <w:rPr>
+          <w:rFonts w:ascii="Times New Roman" w:hAnsi="Times New Roman" w:cs="Times New Roman"/>
+          <w:sz w:val="28"/>
+          <w:szCs w:val="28"/>
+        </w:rPr>
+        <w:t xml:space="preserve"> </w:t>
+      </w:r>
+      <w:r>
+        <w:rPr>
+          <w:rFonts w:ascii="Times New Roman" w:hAnsi="Times New Roman" w:cs="Times New Roman"/>
+          <w:sz w:val="28"/>
+          <w:szCs w:val="28"/>
+        </w:rPr>
+        <w:t>Vegetable</w:t>
+      </w:r>
+      <w:r>
+        <w:rPr>
+          <w:rFonts w:ascii="Times New Roman" w:hAnsi="Times New Roman" w:cs="Times New Roman"/>
+          <w:sz w:val="28"/>
+          <w:szCs w:val="28"/>
+        </w:rPr>
+        <w:t xml:space="preserve"> </w:t>
+      </w:r>
+      <w:r>
+        <w:rPr>
+          <w:rFonts w:ascii="Times New Roman" w:hAnsi="Times New Roman" w:cs="Times New Roman"/>
+          <w:sz w:val="28"/>
+          <w:szCs w:val="28"/>
+        </w:rPr>
+        <w:t xml:space="preserve">- </w:t>
+      </w:r>
+      <w:r>
+        <w:rPr>
+          <w:rFonts w:ascii="Times New Roman" w:hAnsi="Times New Roman" w:cs="Times New Roman"/>
+          <w:sz w:val="28"/>
+          <w:szCs w:val="28"/>
+        </w:rPr>
+        <w:t>_________________________________</w:t>
+      </w:r>
+      <w:r>
+        <w:rPr>
+          <w:rFonts w:ascii="Times New Roman" w:hAnsi="Times New Roman" w:cs="Times New Roman"/>
+          <w:sz w:val="28"/>
+          <w:szCs w:val="28"/>
+        </w:rPr>
+        <w:t>___________</w:t>
+      </w:r>
+      <w:r>
+        <w:rPr>
+          <w:rFonts w:ascii="Times New Roman" w:hAnsi="Times New Roman" w:cs="Times New Roman"/>
+          <w:sz w:val="28"/>
+          <w:szCs w:val="28"/>
+        </w:rPr>
+        <w:t>______________</w:t>
+      </w:r>
+    </w:p>
+    <w:p>
+      <w:pPr>
+        <w:suppressLineNumbers/>
+        <w:spacing w:after="0"/>
+        <w:rPr>
+          <w:rFonts w:ascii="Times New Roman" w:hAnsi="Times New Roman" w:cs="Times New Roman"/>
+          <w:sz w:val="28"/>
+          <w:szCs w:val="28"/>
+        </w:rPr>
+      </w:pPr>
+      <w:r>
+        <w:rPr>
+          <w:rFonts w:ascii="Times New Roman" w:hAnsi="Times New Roman" w:cs="Times New Roman"/>
+          <w:sz w:val="28"/>
+          <w:szCs w:val="28"/>
+        </w:rPr>
+        <w:t xml:space="preserve">            </w:t>
+      </w:r>
+      <w:r>
+        <w:rPr>
+          <w:rFonts w:ascii="Times New Roman" w:hAnsi="Times New Roman" w:cs="Times New Roman"/>
+          <w:sz w:val="28"/>
+          <w:szCs w:val="28"/>
+        </w:rPr>
+        <w:t>Juice</w:t>
+      </w:r>
+      <w:r>
+        <w:rPr>
+          <w:rFonts w:ascii="Times New Roman" w:hAnsi="Times New Roman" w:cs="Times New Roman"/>
+          <w:sz w:val="28"/>
+          <w:szCs w:val="28"/>
+        </w:rPr>
+        <w:t xml:space="preserve"> </w:t>
+      </w:r>
+      <w:r>
+        <w:rPr>
+          <w:rFonts w:ascii="Times New Roman" w:hAnsi="Times New Roman" w:cs="Times New Roman"/>
+          <w:sz w:val="28"/>
+          <w:szCs w:val="28"/>
+        </w:rPr>
+        <w:t xml:space="preserve">- </w:t>
+      </w:r>
+      <w:r>
+        <w:rPr>
+          <w:rFonts w:ascii="Times New Roman" w:hAnsi="Times New Roman" w:cs="Times New Roman"/>
+          <w:sz w:val="28"/>
+          <w:szCs w:val="28"/>
+        </w:rPr>
+        <w:t>_________________________________</w:t>
+      </w:r>
+      <w:r>
+        <w:rPr>
+          <w:rFonts w:ascii="Times New Roman" w:hAnsi="Times New Roman" w:cs="Times New Roman"/>
+          <w:sz w:val="28"/>
+          <w:szCs w:val="28"/>
+        </w:rPr>
+        <w:t>___________</w:t>
+      </w:r>
+      <w:r>
+        <w:rPr>
+          <w:rFonts w:ascii="Times New Roman" w:hAnsi="Times New Roman" w:cs="Times New Roman"/>
+          <w:sz w:val="28"/>
+          <w:szCs w:val="28"/>
+        </w:rPr>
+        <w:t>__________________</w:t>
+      </w:r>
+    </w:p>
+    <w:p>
+      <w:pPr>
+        <w:suppressLineNumbers/>
+        <w:spacing w:after="0" w:line="360" w:lineRule="auto"/>
+        <w:rPr>
+          <w:rFonts w:ascii="Times New Roman" w:hAnsi="Times New Roman" w:cs="Times New Roman"/>
+          <w:b/>
+          <w:bCs/>
+          <w:sz w:val="28"/>
+          <w:szCs w:val="28"/>
+        </w:rPr>
+      </w:pPr>
+      <w:r>
+        <w:rPr>
+          <w:rFonts w:ascii="Times New Roman" w:hAnsi="Times New Roman" w:cs="Times New Roman"/>
+          <w:b/>
+          <w:bCs/>
+          <w:sz w:val="28"/>
+          <w:szCs w:val="28"/>
+        </w:rPr>
+        <w:t xml:space="preserve">Q.no 7. Make words.                                                  </w:t>
+      </w:r>
+      <w:r>
+        <w:rPr>
+          <w:rFonts w:ascii="Times New Roman" w:hAnsi="Times New Roman" w:cs="Times New Roman"/>
+          <w:b/>
+          <w:bCs/>
+          <w:sz w:val="28"/>
+          <w:szCs w:val="28"/>
+        </w:rPr>
+        <w:t xml:space="preserve">                          </w:t>
+      </w:r>
+      <w:r>
+        <w:rPr>
+          <w:rFonts w:ascii="Times New Roman" w:hAnsi="Times New Roman" w:cs="Times New Roman"/>
+          <w:b/>
+          <w:bCs/>
+          <w:sz w:val="28"/>
+          <w:szCs w:val="28"/>
+        </w:rPr>
+        <w:t xml:space="preserve">    </w:t>
+      </w:r>
+      <w:r>
+        <w:rPr>
+          <w:rFonts w:ascii="Times New Roman" w:hAnsi="Times New Roman" w:cs="Times New Roman"/>
+          <w:b/>
+          <w:bCs/>
+          <w:sz w:val="28"/>
+          <w:szCs w:val="28"/>
+        </w:rPr>
+        <w:tab/>
+      </w:r>
+      <w:r>
+        <w:rPr>
+          <w:rFonts w:ascii="Times New Roman" w:hAnsi="Times New Roman" w:cs="Times New Roman"/>
+          <w:b/>
+          <w:bCs/>
+          <w:sz w:val="28"/>
+          <w:szCs w:val="28"/>
+        </w:rPr>
+        <w:tab/>
+      </w:r>
+      <w:r>
+        <w:rPr>
+          <w:rFonts w:ascii="Times New Roman" w:hAnsi="Times New Roman" w:cs="Times New Roman"/>
+          <w:b/>
+          <w:bCs/>
+          <w:sz w:val="28"/>
+          <w:szCs w:val="28"/>
+        </w:rPr>
+        <w:t>[4]</w:t>
+      </w:r>
+    </w:p>
+    <w:p>
+      <w:pPr>
+        <w:suppressLineNumbers/>
+        <w:spacing w:after="0" w:line="360" w:lineRule="auto"/>
+        <w:rPr>
+          <w:rFonts w:ascii="Times New Roman" w:hAnsi="Times New Roman" w:cs="Times New Roman"/>
+          <w:sz w:val="28"/>
+          <w:szCs w:val="28"/>
+        </w:rPr>
+      </w:pPr>
+      <w:r>
+        <w:rPr>
+          <w:rFonts w:ascii="Times New Roman" w:hAnsi="Times New Roman" w:cs="Times New Roman"/>
+          <w:sz w:val="28"/>
+          <w:szCs w:val="28"/>
+        </w:rPr>
+        <w:t xml:space="preserve">            </w:t>
+      </w:r>
+      <w:proofErr w:type="spellStart"/>
+      <w:r>
+        <w:rPr>
+          <w:rFonts w:ascii="Times New Roman" w:hAnsi="Times New Roman" w:cs="Times New Roman"/>
+          <w:sz w:val="28"/>
+          <w:szCs w:val="28"/>
+        </w:rPr>
+        <w:t>kspi</w:t>
+      </w:r>
+      <w:proofErr w:type="spellEnd"/>
+      <w:r>
+        <w:rPr>
+          <w:rFonts w:ascii="Times New Roman" w:hAnsi="Times New Roman" w:cs="Times New Roman"/>
+          <w:sz w:val="28"/>
+          <w:szCs w:val="28"/>
+        </w:rPr>
+        <w:t xml:space="preserve"> - </w:t>
+      </w:r>
+      <w:r>
+        <w:rPr>
+          <w:rFonts w:ascii="Times New Roman" w:hAnsi="Times New Roman" w:cs="Times New Roman"/>
+          <w:sz w:val="28"/>
+          <w:szCs w:val="28"/>
+        </w:rPr>
+        <w:t>___________</w:t>
+      </w:r>
+      <w:r>
+        <w:rPr>
+          <w:rFonts w:ascii="Times New Roman" w:hAnsi="Times New Roman" w:cs="Times New Roman"/>
+          <w:sz w:val="28"/>
+          <w:szCs w:val="28"/>
+        </w:rPr>
+        <w:t xml:space="preserve">               </w:t>
+      </w:r>
+      <w:r>
+        <w:rPr>
+          <w:rFonts w:ascii="Times New Roman" w:hAnsi="Times New Roman" w:cs="Times New Roman"/>
+          <w:sz w:val="28"/>
+          <w:szCs w:val="28"/>
+        </w:rPr>
+        <w:t xml:space="preserve">                              </w:t>
+      </w:r>
+      <w:r>
+        <w:rPr>
+          <w:rFonts w:ascii="Times New Roman" w:hAnsi="Times New Roman" w:cs="Times New Roman"/>
+          <w:sz w:val="28"/>
+          <w:szCs w:val="28"/>
+        </w:rPr>
+        <w:t>lows</w:t>
+      </w:r>
+      <w:r>
+        <w:rPr>
+          <w:rFonts w:ascii="Times New Roman" w:hAnsi="Times New Roman" w:cs="Times New Roman"/>
+          <w:sz w:val="28"/>
+          <w:szCs w:val="28"/>
+        </w:rPr>
+        <w:t xml:space="preserve"> </w:t>
+      </w:r>
+      <w:r>
+        <w:rPr>
+          <w:rFonts w:ascii="Times New Roman" w:hAnsi="Times New Roman" w:cs="Times New Roman"/>
+          <w:sz w:val="28"/>
+          <w:szCs w:val="28"/>
+        </w:rPr>
+        <w:t>- ___________</w:t>
       </w:r>
     </w:p>
     <w:p>
@@ -2531,71 +3534,156 @@
         <w:spacing w:after="0" w:line="240" w:lineRule="auto"/>
         <w:rPr>
           <w:rFonts w:ascii="Times New Roman" w:hAnsi="Times New Roman" w:cs="Times New Roman"/>
-          <w:b/>
-          <w:bCs/>
-          <w:sz w:val="28"/>
-          <w:szCs w:val="28"/>
-        </w:rPr>
-      </w:pPr>
-      <w:r>
-        <w:rPr>
-          <w:rFonts w:ascii="Times New Roman" w:hAnsi="Times New Roman" w:cs="Times New Roman"/>
-          <w:b/>
-          <w:bCs/>
-          <w:sz w:val="28"/>
-          <w:szCs w:val="28"/>
-        </w:rPr>
-        <w:t>Q.no 5. Match the following</w:t>
-      </w:r>
-      <w:r>
-        <w:rPr>
-          <w:rFonts w:ascii="Times New Roman" w:hAnsi="Times New Roman" w:cs="Times New Roman"/>
-          <w:b/>
-          <w:bCs/>
-          <w:sz w:val="28"/>
-          <w:szCs w:val="28"/>
-        </w:rPr>
-        <w:t xml:space="preserve"> words with their meaning</w:t>
-      </w:r>
-      <w:r>
-        <w:rPr>
-          <w:rFonts w:ascii="Times New Roman" w:hAnsi="Times New Roman" w:cs="Times New Roman"/>
-          <w:b/>
-          <w:bCs/>
-          <w:sz w:val="28"/>
-          <w:szCs w:val="28"/>
-        </w:rPr>
-        <w:t xml:space="preserve">.     </w:t>
-      </w:r>
-      <w:r>
-        <w:rPr>
-          <w:rFonts w:ascii="Times New Roman" w:hAnsi="Times New Roman" w:cs="Times New Roman"/>
-          <w:b/>
-          <w:bCs/>
-          <w:sz w:val="28"/>
-          <w:szCs w:val="28"/>
-        </w:rPr>
-        <w:t xml:space="preserve">       </w:t>
-      </w:r>
-      <w:r>
-        <w:rPr>
-          <w:rFonts w:ascii="Times New Roman" w:hAnsi="Times New Roman" w:cs="Times New Roman"/>
-          <w:b/>
-          <w:bCs/>
-          <w:sz w:val="28"/>
-          <w:szCs w:val="28"/>
-        </w:rPr>
-        <w:t xml:space="preserve">     </w:t>
-      </w:r>
-      <w:r>
-        <w:rPr>
-          <w:rFonts w:ascii="Times New Roman" w:hAnsi="Times New Roman" w:cs="Times New Roman"/>
-          <w:b/>
-          <w:bCs/>
-          <w:sz w:val="28"/>
-          <w:szCs w:val="28"/>
-        </w:rPr>
-        <w:t xml:space="preserve">     </w:t>
+          <w:sz w:val="28"/>
+          <w:szCs w:val="28"/>
+        </w:rPr>
+      </w:pPr>
+      <w:r>
+        <w:rPr>
+          <w:rFonts w:ascii="Times New Roman" w:hAnsi="Times New Roman" w:cs="Times New Roman"/>
+          <w:sz w:val="28"/>
+          <w:szCs w:val="28"/>
+        </w:rPr>
+        <w:t xml:space="preserve">            </w:t>
+      </w:r>
+      <w:proofErr w:type="spellStart"/>
+      <w:r>
+        <w:rPr>
+          <w:rFonts w:ascii="Times New Roman" w:hAnsi="Times New Roman" w:cs="Times New Roman"/>
+          <w:sz w:val="28"/>
+          <w:szCs w:val="28"/>
+        </w:rPr>
+        <w:t>anbana</w:t>
+      </w:r>
+      <w:proofErr w:type="spellEnd"/>
+      <w:r>
+        <w:rPr>
+          <w:rFonts w:ascii="Times New Roman" w:hAnsi="Times New Roman" w:cs="Times New Roman"/>
+          <w:sz w:val="28"/>
+          <w:szCs w:val="28"/>
+        </w:rPr>
+        <w:t xml:space="preserve"> -</w:t>
+      </w:r>
+      <w:r>
+        <w:rPr>
+          <w:rFonts w:ascii="Times New Roman" w:hAnsi="Times New Roman" w:cs="Times New Roman"/>
+          <w:sz w:val="28"/>
+          <w:szCs w:val="28"/>
+        </w:rPr>
+        <w:t xml:space="preserve"> ___________</w:t>
+      </w:r>
+      <w:r>
+        <w:rPr>
+          <w:rFonts w:ascii="Times New Roman" w:hAnsi="Times New Roman" w:cs="Times New Roman"/>
+          <w:sz w:val="28"/>
+          <w:szCs w:val="28"/>
+        </w:rPr>
+        <w:t xml:space="preserve">           </w:t>
+      </w:r>
+      <w:r>
+        <w:rPr>
+          <w:rFonts w:ascii="Times New Roman" w:hAnsi="Times New Roman" w:cs="Times New Roman"/>
+          <w:sz w:val="28"/>
+          <w:szCs w:val="28"/>
+        </w:rPr>
+        <w:t xml:space="preserve">                            </w:t>
+      </w:r>
+      <w:r>
+        <w:rPr>
+          <w:rFonts w:ascii="Times New Roman" w:hAnsi="Times New Roman" w:cs="Times New Roman"/>
+          <w:sz w:val="28"/>
+          <w:szCs w:val="28"/>
+        </w:rPr>
+        <w:t xml:space="preserve"> </w:t>
+      </w:r>
+      <w:proofErr w:type="spellStart"/>
+      <w:r>
+        <w:rPr>
+          <w:rFonts w:ascii="Times New Roman" w:hAnsi="Times New Roman" w:cs="Times New Roman"/>
+          <w:sz w:val="28"/>
+          <w:szCs w:val="28"/>
+        </w:rPr>
+        <w:t>tapoto</w:t>
+      </w:r>
+      <w:proofErr w:type="spellEnd"/>
+      <w:r>
+        <w:rPr>
+          <w:rFonts w:ascii="Times New Roman" w:hAnsi="Times New Roman" w:cs="Times New Roman"/>
+          <w:sz w:val="28"/>
+          <w:szCs w:val="28"/>
+        </w:rPr>
+        <w:t xml:space="preserve"> </w:t>
+      </w:r>
+      <w:r>
+        <w:rPr>
+          <w:rFonts w:ascii="Times New Roman" w:hAnsi="Times New Roman" w:cs="Times New Roman"/>
+          <w:sz w:val="28"/>
+          <w:szCs w:val="28"/>
+        </w:rPr>
+        <w:t>- ___________</w:t>
+      </w:r>
+    </w:p>
+    <w:p>
+      <w:pPr>
+        <w:suppressLineNumbers/>
+        <w:spacing w:after="0"/>
+        <w:rPr>
+          <w:rFonts w:ascii="Times New Roman" w:hAnsi="Times New Roman" w:cs="Times New Roman"/>
+          <w:b/>
+          <w:bCs/>
+          <w:sz w:val="28"/>
+          <w:szCs w:val="28"/>
+        </w:rPr>
+      </w:pPr>
+      <w:r>
+        <w:rPr>
+          <w:rFonts w:ascii="Times New Roman" w:hAnsi="Times New Roman" w:cs="Times New Roman"/>
+          <w:b/>
+          <w:bCs/>
+          <w:sz w:val="28"/>
+          <w:szCs w:val="28"/>
+        </w:rPr>
+        <w:t xml:space="preserve">q.no 8. Write </w:t>
+      </w:r>
+      <w:r>
+        <w:rPr>
+          <w:rFonts w:ascii="Times New Roman" w:hAnsi="Times New Roman" w:cs="Times New Roman"/>
+          <w:b/>
+          <w:bCs/>
+          <w:sz w:val="28"/>
+          <w:szCs w:val="28"/>
+        </w:rPr>
+        <w:t xml:space="preserve">similar words.                                  </w:t>
+      </w:r>
+      <w:r>
+        <w:rPr>
+          <w:rFonts w:ascii="Times New Roman" w:hAnsi="Times New Roman" w:cs="Times New Roman"/>
+          <w:b/>
+          <w:bCs/>
+          <w:sz w:val="28"/>
+          <w:szCs w:val="28"/>
+        </w:rPr>
+        <w:t xml:space="preserve">  </w:t>
+      </w:r>
+      <w:r>
+        <w:rPr>
+          <w:rFonts w:ascii="Times New Roman" w:hAnsi="Times New Roman" w:cs="Times New Roman"/>
+          <w:b/>
+          <w:bCs/>
+          <w:sz w:val="28"/>
+          <w:szCs w:val="28"/>
+        </w:rPr>
+        <w:t xml:space="preserve">                           </w:t>
+      </w:r>
+      <w:r>
+        <w:rPr>
+          <w:rFonts w:ascii="Times New Roman" w:hAnsi="Times New Roman" w:cs="Times New Roman"/>
+          <w:b/>
+          <w:bCs/>
+          <w:sz w:val="28"/>
+          <w:szCs w:val="28"/>
+        </w:rPr>
+        <w:t xml:space="preserve">   </w:t>
       </w:r>
       <w:r>
         <w:rPr>
@@ -2625,7 +3713,101 @@
           <w:sz w:val="28"/>
           <w:szCs w:val="28"/>
         </w:rPr>
-        <w:t>[5]</w:t>
+        <w:t>[4]</w:t>
+      </w:r>
+    </w:p>
+    <w:p>
+      <w:pPr>
+        <w:suppressLineNumbers/>
+        <w:spacing w:after="0" w:line="360" w:lineRule="auto"/>
+        <w:rPr>
+          <w:rFonts w:ascii="Times New Roman" w:hAnsi="Times New Roman" w:cs="Times New Roman"/>
+          <w:sz w:val="28"/>
+          <w:szCs w:val="28"/>
+        </w:rPr>
+      </w:pPr>
+      <w:r>
+        <w:rPr>
+          <w:rFonts w:ascii="Times New Roman" w:hAnsi="Times New Roman" w:cs="Times New Roman"/>
+          <w:sz w:val="28"/>
+          <w:szCs w:val="28"/>
+        </w:rPr>
+        <w:t xml:space="preserve">          a) </w:t>
+      </w:r>
+      <w:r>
+        <w:rPr>
+          <w:rFonts w:ascii="Times New Roman" w:hAnsi="Times New Roman" w:cs="Times New Roman"/>
+          <w:sz w:val="28"/>
+          <w:szCs w:val="28"/>
+        </w:rPr>
+        <w:t xml:space="preserve"> Beautiful- </w:t>
+      </w:r>
+      <w:r>
+        <w:rPr>
+          <w:rFonts w:ascii="Times New Roman" w:hAnsi="Times New Roman" w:cs="Times New Roman"/>
+          <w:sz w:val="28"/>
+          <w:szCs w:val="28"/>
+        </w:rPr>
+        <w:t>___________</w:t>
+      </w:r>
+      <w:r>
+        <w:rPr>
+          <w:rFonts w:ascii="Times New Roman" w:hAnsi="Times New Roman" w:cs="Times New Roman"/>
+          <w:sz w:val="28"/>
+          <w:szCs w:val="28"/>
+        </w:rPr>
+        <w:t xml:space="preserve">                                  c) Rush-</w:t>
+      </w:r>
+      <w:r>
+        <w:rPr>
+          <w:rFonts w:ascii="Times New Roman" w:hAnsi="Times New Roman" w:cs="Times New Roman"/>
+          <w:sz w:val="28"/>
+          <w:szCs w:val="28"/>
+        </w:rPr>
+        <w:t xml:space="preserve"> ___________</w:t>
+      </w:r>
+    </w:p>
+    <w:p>
+      <w:pPr>
+        <w:suppressLineNumbers/>
+        <w:spacing w:after="0" w:line="360" w:lineRule="auto"/>
+        <w:rPr>
+          <w:rFonts w:ascii="Times New Roman" w:hAnsi="Times New Roman" w:cs="Times New Roman"/>
+          <w:sz w:val="28"/>
+          <w:szCs w:val="28"/>
+        </w:rPr>
+      </w:pPr>
+      <w:r>
+        <w:rPr>
+          <w:rFonts w:ascii="Times New Roman" w:hAnsi="Times New Roman" w:cs="Times New Roman"/>
+          <w:sz w:val="28"/>
+          <w:szCs w:val="28"/>
+        </w:rPr>
+        <w:t xml:space="preserve">          b)  Forest- </w:t>
+      </w:r>
+      <w:r>
+        <w:rPr>
+          <w:rFonts w:ascii="Times New Roman" w:hAnsi="Times New Roman" w:cs="Times New Roman"/>
+          <w:sz w:val="28"/>
+          <w:szCs w:val="28"/>
+        </w:rPr>
+        <w:t>___________</w:t>
+      </w:r>
+      <w:r>
+        <w:rPr>
+          <w:rFonts w:ascii="Times New Roman" w:hAnsi="Times New Roman" w:cs="Times New Roman"/>
+          <w:sz w:val="28"/>
+          <w:szCs w:val="28"/>
+        </w:rPr>
+        <w:t xml:space="preserve">                                       d) Foolish-</w:t>
+      </w:r>
+      <w:r>
+        <w:rPr>
+          <w:rFonts w:ascii="Times New Roman" w:hAnsi="Times New Roman" w:cs="Times New Roman"/>
+          <w:sz w:val="28"/>
+          <w:szCs w:val="28"/>
+        </w:rPr>
+        <w:t xml:space="preserve"> ___________</w:t>
       </w:r>
     </w:p>
     <w:p>
@@ -2634,29 +3816,47 @@
         <w:spacing w:after="0" w:line="240" w:lineRule="auto"/>
         <w:rPr>
           <w:rFonts w:ascii="Times New Roman" w:hAnsi="Times New Roman" w:cs="Times New Roman"/>
-          <w:sz w:val="28"/>
-          <w:szCs w:val="28"/>
-        </w:rPr>
-      </w:pPr>
-      <w:r>
-        <w:rPr>
-          <w:rFonts w:ascii="Times New Roman" w:hAnsi="Times New Roman" w:cs="Times New Roman"/>
-          <w:sz w:val="28"/>
-          <w:szCs w:val="28"/>
-        </w:rPr>
-        <w:t xml:space="preserve">           Kids</w:t>
-      </w:r>
-      <w:r>
-        <w:rPr>
-          <w:rFonts w:ascii="Times New Roman" w:hAnsi="Times New Roman" w:cs="Times New Roman"/>
-          <w:sz w:val="28"/>
-          <w:szCs w:val="28"/>
-        </w:rPr>
-        <w:t xml:space="preserve">                                         </w:t>
-      </w:r>
-      <w:r>
-        <w:rPr>
-          <w:rFonts w:ascii="Times New Roman" w:hAnsi="Times New Roman" w:cs="Times New Roman"/>
+          <w:b/>
+          <w:bCs/>
+          <w:sz w:val="28"/>
+          <w:szCs w:val="28"/>
+        </w:rPr>
+      </w:pPr>
+      <w:r>
+        <w:rPr>
+          <w:rFonts w:ascii="Times New Roman" w:hAnsi="Times New Roman" w:cs="Times New Roman"/>
+          <w:b/>
+          <w:bCs/>
+          <w:sz w:val="28"/>
+          <w:szCs w:val="28"/>
+        </w:rPr>
+        <w:t xml:space="preserve">Q.no 9. Answer the questions.                                              </w:t>
+      </w:r>
+      <w:r>
+        <w:rPr>
+          <w:rFonts w:ascii="Times New Roman" w:hAnsi="Times New Roman" w:cs="Times New Roman"/>
+          <w:b/>
+          <w:bCs/>
+          <w:sz w:val="28"/>
+          <w:szCs w:val="28"/>
+        </w:rPr>
+        <w:t xml:space="preserve">                       </w:t>
+      </w:r>
+      <w:r>
+        <w:rPr>
+          <w:rFonts w:ascii="Times New Roman" w:hAnsi="Times New Roman" w:cs="Times New Roman"/>
+          <w:b/>
+          <w:bCs/>
+          <w:sz w:val="28"/>
+          <w:szCs w:val="28"/>
+        </w:rPr>
+        <w:t xml:space="preserve">   </w:t>
+      </w:r>
+      <w:r>
+        <w:rPr>
+          <w:rFonts w:ascii="Times New Roman" w:hAnsi="Times New Roman" w:cs="Times New Roman"/>
+          <w:b/>
+          <w:bCs/>
           <w:sz w:val="28"/>
           <w:szCs w:val="28"/>
         </w:rPr>
@@ -2665,41 +3865,8 @@
       <w:r>
         <w:rPr>
           <w:rFonts w:ascii="Times New Roman" w:hAnsi="Times New Roman" w:cs="Times New Roman"/>
-          <w:sz w:val="28"/>
-          <w:szCs w:val="28"/>
-        </w:rPr>
-        <w:t>what we prefer</w:t>
-      </w:r>
-    </w:p>
-    <w:p>
-      <w:pPr>
-        <w:suppressLineNumbers/>
-        <w:spacing w:after="0" w:line="240" w:lineRule="auto"/>
-        <w:rPr>
-          <w:rFonts w:ascii="Times New Roman" w:hAnsi="Times New Roman" w:cs="Times New Roman"/>
-          <w:sz w:val="28"/>
-          <w:szCs w:val="28"/>
-        </w:rPr>
-      </w:pPr>
-      <w:r>
-        <w:rPr>
-          <w:rFonts w:ascii="Times New Roman" w:hAnsi="Times New Roman" w:cs="Times New Roman"/>
-          <w:sz w:val="28"/>
-          <w:szCs w:val="28"/>
-        </w:rPr>
-        <w:t xml:space="preserve">           Favourite</w:t>
-      </w:r>
-      <w:r>
-        <w:rPr>
-          <w:rFonts w:ascii="Times New Roman" w:hAnsi="Times New Roman" w:cs="Times New Roman"/>
-          <w:sz w:val="28"/>
-          <w:szCs w:val="28"/>
-        </w:rPr>
-        <w:t xml:space="preserve">                                  </w:t>
-      </w:r>
-      <w:r>
-        <w:rPr>
-          <w:rFonts w:ascii="Times New Roman" w:hAnsi="Times New Roman" w:cs="Times New Roman"/>
+          <w:b/>
+          <w:bCs/>
           <w:sz w:val="28"/>
           <w:szCs w:val="28"/>
         </w:rPr>
@@ -2708,876 +3875,12 @@
       <w:r>
         <w:rPr>
           <w:rFonts w:ascii="Times New Roman" w:hAnsi="Times New Roman" w:cs="Times New Roman"/>
-          <w:sz w:val="28"/>
-          <w:szCs w:val="28"/>
-        </w:rPr>
-        <w:t>full of juice</w:t>
-      </w:r>
-    </w:p>
-    <w:p>
-      <w:pPr>
-        <w:suppressLineNumbers/>
-        <w:spacing w:after="0" w:line="240" w:lineRule="auto"/>
-        <w:rPr>
-          <w:rFonts w:ascii="Times New Roman" w:hAnsi="Times New Roman" w:cs="Times New Roman"/>
-          <w:sz w:val="28"/>
-          <w:szCs w:val="28"/>
-        </w:rPr>
-      </w:pPr>
-      <w:r>
-        <w:rPr>
-          <w:rFonts w:ascii="Times New Roman" w:hAnsi="Times New Roman" w:cs="Times New Roman"/>
-          <w:sz w:val="28"/>
-          <w:szCs w:val="28"/>
-        </w:rPr>
-        <w:t xml:space="preserve">         </w:t>
-      </w:r>
-      <w:r>
-        <w:rPr>
-          <w:rFonts w:ascii="Times New Roman" w:hAnsi="Times New Roman" w:cs="Times New Roman"/>
-          <w:sz w:val="28"/>
-          <w:szCs w:val="28"/>
-        </w:rPr>
-        <w:t xml:space="preserve"> </w:t>
-      </w:r>
-      <w:r>
-        <w:rPr>
-          <w:rFonts w:ascii="Times New Roman" w:hAnsi="Times New Roman" w:cs="Times New Roman"/>
-          <w:sz w:val="28"/>
-          <w:szCs w:val="28"/>
-        </w:rPr>
-        <w:t>Juicy</w:t>
-      </w:r>
-      <w:r>
-        <w:rPr>
-          <w:rFonts w:ascii="Times New Roman" w:hAnsi="Times New Roman" w:cs="Times New Roman"/>
-          <w:sz w:val="28"/>
-          <w:szCs w:val="28"/>
-        </w:rPr>
-        <w:t xml:space="preserve">                                         </w:t>
-      </w:r>
-      <w:r>
-        <w:rPr>
-          <w:rFonts w:ascii="Times New Roman" w:hAnsi="Times New Roman" w:cs="Times New Roman"/>
-          <w:sz w:val="28"/>
-          <w:szCs w:val="28"/>
-        </w:rPr>
-        <w:tab/>
-      </w:r>
-      <w:r>
-        <w:rPr>
-          <w:rFonts w:ascii="Times New Roman" w:hAnsi="Times New Roman" w:cs="Times New Roman"/>
-          <w:sz w:val="28"/>
-          <w:szCs w:val="28"/>
-        </w:rPr>
-        <w:t>market</w:t>
-      </w:r>
-    </w:p>
-    <w:p>
-      <w:pPr>
-        <w:suppressLineNumbers/>
-        <w:spacing w:after="0" w:line="240" w:lineRule="auto"/>
-        <w:rPr>
-          <w:rFonts w:ascii="Times New Roman" w:hAnsi="Times New Roman" w:cs="Times New Roman"/>
-          <w:sz w:val="28"/>
-          <w:szCs w:val="28"/>
-        </w:rPr>
-      </w:pPr>
-      <w:r>
-        <w:rPr>
-          <w:rFonts w:ascii="Times New Roman" w:hAnsi="Times New Roman" w:cs="Times New Roman"/>
-          <w:sz w:val="28"/>
-          <w:szCs w:val="28"/>
-        </w:rPr>
-        <w:t xml:space="preserve">          Bazaar</w:t>
-      </w:r>
-      <w:r>
-        <w:rPr>
-          <w:rFonts w:ascii="Times New Roman" w:hAnsi="Times New Roman" w:cs="Times New Roman"/>
-          <w:sz w:val="28"/>
-          <w:szCs w:val="28"/>
-        </w:rPr>
-        <w:t xml:space="preserve">                                       </w:t>
-      </w:r>
-      <w:r>
-        <w:rPr>
-          <w:rFonts w:ascii="Times New Roman" w:hAnsi="Times New Roman" w:cs="Times New Roman"/>
-          <w:sz w:val="28"/>
-          <w:szCs w:val="28"/>
-        </w:rPr>
-        <w:tab/>
-      </w:r>
-      <w:r>
-        <w:rPr>
-          <w:rFonts w:ascii="Times New Roman" w:hAnsi="Times New Roman" w:cs="Times New Roman"/>
-          <w:sz w:val="28"/>
-          <w:szCs w:val="28"/>
-        </w:rPr>
-        <w:t>fruit and vegetable shop</w:t>
-      </w:r>
-    </w:p>
-    <w:p>
-      <w:pPr>
-        <w:suppressLineNumbers/>
-        <w:spacing w:after="0" w:line="240" w:lineRule="auto"/>
-        <w:rPr>
-          <w:rFonts w:ascii="Times New Roman" w:hAnsi="Times New Roman" w:cs="Times New Roman"/>
-          <w:sz w:val="28"/>
-          <w:szCs w:val="28"/>
-        </w:rPr>
-      </w:pPr>
-      <w:r>
-        <w:rPr>
-          <w:rFonts w:ascii="Times New Roman" w:hAnsi="Times New Roman" w:cs="Times New Roman"/>
-          <w:sz w:val="28"/>
-          <w:szCs w:val="28"/>
-        </w:rPr>
-        <w:t xml:space="preserve">          Green                                        </w:t>
-      </w:r>
-      <w:r>
-        <w:rPr>
-          <w:rFonts w:ascii="Times New Roman" w:hAnsi="Times New Roman" w:cs="Times New Roman"/>
-          <w:sz w:val="28"/>
-          <w:szCs w:val="28"/>
-        </w:rPr>
-        <w:tab/>
-      </w:r>
-      <w:r>
-        <w:rPr>
-          <w:rFonts w:ascii="Times New Roman" w:hAnsi="Times New Roman" w:cs="Times New Roman"/>
-          <w:sz w:val="28"/>
-          <w:szCs w:val="28"/>
-        </w:rPr>
-        <w:t xml:space="preserve">children </w:t>
-      </w:r>
-    </w:p>
-    <w:p>
-      <w:pPr>
-        <w:suppressLineNumbers/>
-        <w:spacing w:after="0"/>
-        <w:rPr>
-          <w:rFonts w:ascii="Times New Roman" w:hAnsi="Times New Roman" w:cs="Times New Roman"/>
-          <w:b/>
-          <w:bCs/>
-          <w:sz w:val="28"/>
-          <w:szCs w:val="28"/>
-        </w:rPr>
-      </w:pPr>
-    </w:p>
-    <w:p>
-      <w:pPr>
-        <w:suppressLineNumbers/>
-        <w:spacing w:after="0"/>
-        <w:rPr>
-          <w:rFonts w:ascii="Times New Roman" w:hAnsi="Times New Roman" w:cs="Times New Roman"/>
-          <w:b/>
-          <w:bCs/>
-          <w:sz w:val="28"/>
-          <w:szCs w:val="28"/>
-        </w:rPr>
-      </w:pPr>
-      <w:r>
-        <w:rPr>
-          <w:rFonts w:ascii="Times New Roman" w:hAnsi="Times New Roman" w:cs="Times New Roman"/>
-          <w:b/>
-          <w:bCs/>
-          <w:sz w:val="28"/>
-          <w:szCs w:val="28"/>
-        </w:rPr>
-        <w:lastRenderedPageBreak/>
-        <w:t>Q.no 6. Make sent</w:t>
-      </w:r>
-      <w:r>
-        <w:rPr>
-          <w:rFonts w:ascii="Times New Roman" w:hAnsi="Times New Roman" w:cs="Times New Roman"/>
-          <w:b/>
-          <w:bCs/>
-          <w:sz w:val="28"/>
-          <w:szCs w:val="28"/>
-        </w:rPr>
-        <w:t>ences by using following words.</w:t>
-      </w:r>
-      <w:r>
-        <w:rPr>
-          <w:rFonts w:ascii="Times New Roman" w:hAnsi="Times New Roman" w:cs="Times New Roman"/>
-          <w:b/>
-          <w:bCs/>
-          <w:sz w:val="28"/>
-          <w:szCs w:val="28"/>
-        </w:rPr>
-        <w:t xml:space="preserve">                            </w:t>
-      </w:r>
-      <w:r>
-        <w:rPr>
-          <w:rFonts w:ascii="Times New Roman" w:hAnsi="Times New Roman" w:cs="Times New Roman"/>
-          <w:b/>
-          <w:bCs/>
-          <w:sz w:val="28"/>
-          <w:szCs w:val="28"/>
-        </w:rPr>
-        <w:t xml:space="preserve">    </w:t>
-      </w:r>
-      <w:r>
-        <w:rPr>
-          <w:rFonts w:ascii="Times New Roman" w:hAnsi="Times New Roman" w:cs="Times New Roman"/>
-          <w:b/>
-          <w:bCs/>
-          <w:sz w:val="28"/>
-          <w:szCs w:val="28"/>
-        </w:rPr>
-        <w:tab/>
-      </w:r>
-      <w:r>
-        <w:rPr>
-          <w:rFonts w:ascii="Times New Roman" w:hAnsi="Times New Roman" w:cs="Times New Roman"/>
-          <w:b/>
-          <w:bCs/>
-          <w:sz w:val="28"/>
-          <w:szCs w:val="28"/>
-        </w:rPr>
-        <w:tab/>
-      </w:r>
-      <w:r>
-        <w:rPr>
-          <w:rFonts w:ascii="Times New Roman" w:hAnsi="Times New Roman" w:cs="Times New Roman"/>
-          <w:b/>
-          <w:bCs/>
-          <w:sz w:val="28"/>
-          <w:szCs w:val="28"/>
-        </w:rPr>
-        <w:t>[4]</w:t>
-      </w:r>
-    </w:p>
-    <w:p>
-      <w:pPr>
-        <w:suppressLineNumbers/>
-        <w:spacing w:after="0"/>
-        <w:rPr>
-          <w:rFonts w:ascii="Times New Roman" w:hAnsi="Times New Roman" w:cs="Times New Roman"/>
-          <w:sz w:val="28"/>
-          <w:szCs w:val="28"/>
-        </w:rPr>
-      </w:pPr>
-      <w:r>
-        <w:rPr>
-          <w:rFonts w:ascii="Times New Roman" w:hAnsi="Times New Roman" w:cs="Times New Roman"/>
-          <w:sz w:val="28"/>
-          <w:szCs w:val="28"/>
-        </w:rPr>
-        <w:t xml:space="preserve">            </w:t>
-      </w:r>
-      <w:r>
-        <w:rPr>
-          <w:rFonts w:ascii="Times New Roman" w:hAnsi="Times New Roman" w:cs="Times New Roman"/>
-          <w:sz w:val="28"/>
-          <w:szCs w:val="28"/>
-        </w:rPr>
-        <w:t xml:space="preserve"> </w:t>
-      </w:r>
-      <w:r>
-        <w:rPr>
-          <w:rFonts w:ascii="Times New Roman" w:hAnsi="Times New Roman" w:cs="Times New Roman"/>
-          <w:sz w:val="28"/>
-          <w:szCs w:val="28"/>
-        </w:rPr>
-        <w:t>Fly</w:t>
-      </w:r>
-      <w:r>
-        <w:rPr>
-          <w:rFonts w:ascii="Times New Roman" w:hAnsi="Times New Roman" w:cs="Times New Roman"/>
-          <w:sz w:val="28"/>
-          <w:szCs w:val="28"/>
-        </w:rPr>
-        <w:t xml:space="preserve"> -</w:t>
-      </w:r>
-      <w:r>
-        <w:rPr>
-          <w:rFonts w:ascii="Times New Roman" w:hAnsi="Times New Roman" w:cs="Times New Roman"/>
-          <w:sz w:val="28"/>
-          <w:szCs w:val="28"/>
-        </w:rPr>
-        <w:t xml:space="preserve"> </w:t>
-      </w:r>
-      <w:r>
-        <w:rPr>
-          <w:rFonts w:ascii="Times New Roman" w:hAnsi="Times New Roman" w:cs="Times New Roman"/>
-          <w:sz w:val="28"/>
-          <w:szCs w:val="28"/>
-        </w:rPr>
-        <w:t>_________________________________</w:t>
-      </w:r>
-      <w:r>
-        <w:rPr>
-          <w:rFonts w:ascii="Times New Roman" w:hAnsi="Times New Roman" w:cs="Times New Roman"/>
-          <w:sz w:val="28"/>
-          <w:szCs w:val="28"/>
-        </w:rPr>
-        <w:t>___________</w:t>
-      </w:r>
-      <w:r>
-        <w:rPr>
-          <w:rFonts w:ascii="Times New Roman" w:hAnsi="Times New Roman" w:cs="Times New Roman"/>
-          <w:sz w:val="28"/>
-          <w:szCs w:val="28"/>
-        </w:rPr>
-        <w:t>___________________</w:t>
-      </w:r>
-    </w:p>
-    <w:p>
-      <w:pPr>
-        <w:suppressLineNumbers/>
-        <w:spacing w:after="0"/>
-        <w:rPr>
-          <w:rFonts w:ascii="Times New Roman" w:hAnsi="Times New Roman" w:cs="Times New Roman"/>
-          <w:sz w:val="28"/>
-          <w:szCs w:val="28"/>
-        </w:rPr>
-      </w:pPr>
-      <w:r>
-        <w:rPr>
-          <w:rFonts w:ascii="Times New Roman" w:hAnsi="Times New Roman" w:cs="Times New Roman"/>
-          <w:sz w:val="28"/>
-          <w:szCs w:val="28"/>
-        </w:rPr>
-        <w:t xml:space="preserve">           </w:t>
-      </w:r>
-      <w:r>
-        <w:rPr>
-          <w:rFonts w:ascii="Times New Roman" w:hAnsi="Times New Roman" w:cs="Times New Roman"/>
-          <w:sz w:val="28"/>
-          <w:szCs w:val="28"/>
-        </w:rPr>
-        <w:t xml:space="preserve">  </w:t>
-      </w:r>
-      <w:r>
-        <w:rPr>
-          <w:rFonts w:ascii="Times New Roman" w:hAnsi="Times New Roman" w:cs="Times New Roman"/>
-          <w:sz w:val="28"/>
-          <w:szCs w:val="28"/>
-        </w:rPr>
-        <w:t>Forest</w:t>
-      </w:r>
-      <w:r>
-        <w:rPr>
-          <w:rFonts w:ascii="Times New Roman" w:hAnsi="Times New Roman" w:cs="Times New Roman"/>
-          <w:sz w:val="28"/>
-          <w:szCs w:val="28"/>
-        </w:rPr>
-        <w:t xml:space="preserve"> -</w:t>
-      </w:r>
-      <w:r>
-        <w:rPr>
-          <w:rFonts w:ascii="Times New Roman" w:hAnsi="Times New Roman" w:cs="Times New Roman"/>
-          <w:sz w:val="28"/>
-          <w:szCs w:val="28"/>
-        </w:rPr>
-        <w:t xml:space="preserve"> </w:t>
-      </w:r>
-      <w:r>
-        <w:rPr>
-          <w:rFonts w:ascii="Times New Roman" w:hAnsi="Times New Roman" w:cs="Times New Roman"/>
-          <w:sz w:val="28"/>
-          <w:szCs w:val="28"/>
-        </w:rPr>
-        <w:t>_________________________________</w:t>
-      </w:r>
-      <w:r>
-        <w:rPr>
-          <w:rFonts w:ascii="Times New Roman" w:hAnsi="Times New Roman" w:cs="Times New Roman"/>
-          <w:sz w:val="28"/>
-          <w:szCs w:val="28"/>
-        </w:rPr>
-        <w:t>___________</w:t>
-      </w:r>
-      <w:r>
-        <w:rPr>
-          <w:rFonts w:ascii="Times New Roman" w:hAnsi="Times New Roman" w:cs="Times New Roman"/>
-          <w:sz w:val="28"/>
-          <w:szCs w:val="28"/>
-        </w:rPr>
-        <w:t>_________________</w:t>
-      </w:r>
-    </w:p>
-    <w:p>
-      <w:pPr>
-        <w:suppressLineNumbers/>
-        <w:spacing w:after="0"/>
-        <w:rPr>
-          <w:rFonts w:ascii="Times New Roman" w:hAnsi="Times New Roman" w:cs="Times New Roman"/>
-          <w:sz w:val="28"/>
-          <w:szCs w:val="28"/>
-        </w:rPr>
-      </w:pPr>
-      <w:r>
-        <w:rPr>
-          <w:rFonts w:ascii="Times New Roman" w:hAnsi="Times New Roman" w:cs="Times New Roman"/>
-          <w:sz w:val="28"/>
-          <w:szCs w:val="28"/>
-        </w:rPr>
-        <w:t xml:space="preserve">           </w:t>
-      </w:r>
-      <w:r>
-        <w:rPr>
-          <w:rFonts w:ascii="Times New Roman" w:hAnsi="Times New Roman" w:cs="Times New Roman"/>
-          <w:sz w:val="28"/>
-          <w:szCs w:val="28"/>
-        </w:rPr>
-        <w:t xml:space="preserve"> </w:t>
-      </w:r>
-      <w:r>
-        <w:rPr>
-          <w:rFonts w:ascii="Times New Roman" w:hAnsi="Times New Roman" w:cs="Times New Roman"/>
-          <w:sz w:val="28"/>
-          <w:szCs w:val="28"/>
-        </w:rPr>
-        <w:t>Vegetable</w:t>
-      </w:r>
-      <w:r>
-        <w:rPr>
-          <w:rFonts w:ascii="Times New Roman" w:hAnsi="Times New Roman" w:cs="Times New Roman"/>
-          <w:sz w:val="28"/>
-          <w:szCs w:val="28"/>
-        </w:rPr>
-        <w:t xml:space="preserve"> </w:t>
-      </w:r>
-      <w:r>
-        <w:rPr>
-          <w:rFonts w:ascii="Times New Roman" w:hAnsi="Times New Roman" w:cs="Times New Roman"/>
-          <w:sz w:val="28"/>
-          <w:szCs w:val="28"/>
-        </w:rPr>
-        <w:t xml:space="preserve">- </w:t>
-      </w:r>
-      <w:r>
-        <w:rPr>
-          <w:rFonts w:ascii="Times New Roman" w:hAnsi="Times New Roman" w:cs="Times New Roman"/>
-          <w:sz w:val="28"/>
-          <w:szCs w:val="28"/>
-        </w:rPr>
-        <w:t>_________________________________</w:t>
-      </w:r>
-      <w:r>
-        <w:rPr>
-          <w:rFonts w:ascii="Times New Roman" w:hAnsi="Times New Roman" w:cs="Times New Roman"/>
-          <w:sz w:val="28"/>
-          <w:szCs w:val="28"/>
-        </w:rPr>
-        <w:t>___________</w:t>
-      </w:r>
-      <w:r>
-        <w:rPr>
-          <w:rFonts w:ascii="Times New Roman" w:hAnsi="Times New Roman" w:cs="Times New Roman"/>
-          <w:sz w:val="28"/>
-          <w:szCs w:val="28"/>
-        </w:rPr>
-        <w:t>______________</w:t>
-      </w:r>
-    </w:p>
-    <w:p>
-      <w:pPr>
-        <w:suppressLineNumbers/>
-        <w:spacing w:after="0"/>
-        <w:rPr>
-          <w:rFonts w:ascii="Times New Roman" w:hAnsi="Times New Roman" w:cs="Times New Roman"/>
-          <w:sz w:val="28"/>
-          <w:szCs w:val="28"/>
-        </w:rPr>
-      </w:pPr>
-      <w:r>
-        <w:rPr>
-          <w:rFonts w:ascii="Times New Roman" w:hAnsi="Times New Roman" w:cs="Times New Roman"/>
-          <w:sz w:val="28"/>
-          <w:szCs w:val="28"/>
-        </w:rPr>
-        <w:t xml:space="preserve">            </w:t>
-      </w:r>
-      <w:r>
-        <w:rPr>
-          <w:rFonts w:ascii="Times New Roman" w:hAnsi="Times New Roman" w:cs="Times New Roman"/>
-          <w:sz w:val="28"/>
-          <w:szCs w:val="28"/>
-        </w:rPr>
-        <w:t>Juice</w:t>
-      </w:r>
-      <w:r>
-        <w:rPr>
-          <w:rFonts w:ascii="Times New Roman" w:hAnsi="Times New Roman" w:cs="Times New Roman"/>
-          <w:sz w:val="28"/>
-          <w:szCs w:val="28"/>
-        </w:rPr>
-        <w:t xml:space="preserve"> </w:t>
-      </w:r>
-      <w:r>
-        <w:rPr>
-          <w:rFonts w:ascii="Times New Roman" w:hAnsi="Times New Roman" w:cs="Times New Roman"/>
-          <w:sz w:val="28"/>
-          <w:szCs w:val="28"/>
-        </w:rPr>
-        <w:t xml:space="preserve">- </w:t>
-      </w:r>
-      <w:r>
-        <w:rPr>
-          <w:rFonts w:ascii="Times New Roman" w:hAnsi="Times New Roman" w:cs="Times New Roman"/>
-          <w:sz w:val="28"/>
-          <w:szCs w:val="28"/>
-        </w:rPr>
-        <w:t>_________________________________</w:t>
-      </w:r>
-      <w:r>
-        <w:rPr>
-          <w:rFonts w:ascii="Times New Roman" w:hAnsi="Times New Roman" w:cs="Times New Roman"/>
-          <w:sz w:val="28"/>
-          <w:szCs w:val="28"/>
-        </w:rPr>
-        <w:t>___________</w:t>
-      </w:r>
-      <w:r>
-        <w:rPr>
-          <w:rFonts w:ascii="Times New Roman" w:hAnsi="Times New Roman" w:cs="Times New Roman"/>
-          <w:sz w:val="28"/>
-          <w:szCs w:val="28"/>
-        </w:rPr>
-        <w:t>__________________</w:t>
-      </w:r>
-    </w:p>
-    <w:p>
-      <w:pPr>
-        <w:suppressLineNumbers/>
-        <w:spacing w:after="0"/>
-        <w:rPr>
-          <w:rFonts w:ascii="Times New Roman" w:hAnsi="Times New Roman" w:cs="Times New Roman"/>
-          <w:b/>
-          <w:bCs/>
-          <w:sz w:val="28"/>
-          <w:szCs w:val="28"/>
-        </w:rPr>
-      </w:pPr>
-      <w:r>
-        <w:rPr>
-          <w:rFonts w:ascii="Times New Roman" w:hAnsi="Times New Roman" w:cs="Times New Roman"/>
-          <w:b/>
-          <w:bCs/>
-          <w:sz w:val="28"/>
-          <w:szCs w:val="28"/>
-        </w:rPr>
-        <w:t xml:space="preserve">Q.no 7. Make words.                                                  </w:t>
-      </w:r>
-      <w:r>
-        <w:rPr>
-          <w:rFonts w:ascii="Times New Roman" w:hAnsi="Times New Roman" w:cs="Times New Roman"/>
-          <w:b/>
-          <w:bCs/>
-          <w:sz w:val="28"/>
-          <w:szCs w:val="28"/>
-        </w:rPr>
-        <w:t xml:space="preserve">                          </w:t>
-      </w:r>
-      <w:r>
-        <w:rPr>
-          <w:rFonts w:ascii="Times New Roman" w:hAnsi="Times New Roman" w:cs="Times New Roman"/>
-          <w:b/>
-          <w:bCs/>
-          <w:sz w:val="28"/>
-          <w:szCs w:val="28"/>
-        </w:rPr>
-        <w:t xml:space="preserve">    </w:t>
-      </w:r>
-      <w:r>
-        <w:rPr>
-          <w:rFonts w:ascii="Times New Roman" w:hAnsi="Times New Roman" w:cs="Times New Roman"/>
-          <w:b/>
-          <w:bCs/>
-          <w:sz w:val="28"/>
-          <w:szCs w:val="28"/>
-        </w:rPr>
-        <w:tab/>
-      </w:r>
-      <w:r>
-        <w:rPr>
-          <w:rFonts w:ascii="Times New Roman" w:hAnsi="Times New Roman" w:cs="Times New Roman"/>
-          <w:b/>
-          <w:bCs/>
-          <w:sz w:val="28"/>
-          <w:szCs w:val="28"/>
-        </w:rPr>
-        <w:tab/>
-      </w:r>
-      <w:r>
-        <w:rPr>
-          <w:rFonts w:ascii="Times New Roman" w:hAnsi="Times New Roman" w:cs="Times New Roman"/>
-          <w:b/>
-          <w:bCs/>
-          <w:sz w:val="28"/>
-          <w:szCs w:val="28"/>
-        </w:rPr>
-        <w:t>[4]</w:t>
-      </w:r>
-    </w:p>
-    <w:p>
-      <w:pPr>
-        <w:suppressLineNumbers/>
-        <w:spacing w:after="0"/>
-        <w:rPr>
-          <w:rFonts w:ascii="Times New Roman" w:hAnsi="Times New Roman" w:cs="Times New Roman"/>
-          <w:sz w:val="28"/>
-          <w:szCs w:val="28"/>
-        </w:rPr>
-      </w:pPr>
-      <w:r>
-        <w:rPr>
-          <w:rFonts w:ascii="Times New Roman" w:hAnsi="Times New Roman" w:cs="Times New Roman"/>
-          <w:sz w:val="28"/>
-          <w:szCs w:val="28"/>
-        </w:rPr>
-        <w:t xml:space="preserve">            </w:t>
-      </w:r>
-      <w:r>
-        <w:rPr>
-          <w:rFonts w:ascii="Times New Roman" w:hAnsi="Times New Roman" w:cs="Times New Roman"/>
-          <w:sz w:val="28"/>
-          <w:szCs w:val="28"/>
-        </w:rPr>
-        <w:t>kspi</w:t>
-      </w:r>
-      <w:r>
-        <w:rPr>
-          <w:rFonts w:ascii="Times New Roman" w:hAnsi="Times New Roman" w:cs="Times New Roman"/>
-          <w:sz w:val="28"/>
-          <w:szCs w:val="28"/>
-        </w:rPr>
-        <w:t xml:space="preserve"> - </w:t>
-      </w:r>
-      <w:r>
-        <w:rPr>
-          <w:rFonts w:ascii="Times New Roman" w:hAnsi="Times New Roman" w:cs="Times New Roman"/>
-          <w:sz w:val="28"/>
-          <w:szCs w:val="28"/>
-        </w:rPr>
-        <w:t>___________</w:t>
-      </w:r>
-      <w:r>
-        <w:rPr>
-          <w:rFonts w:ascii="Times New Roman" w:hAnsi="Times New Roman" w:cs="Times New Roman"/>
-          <w:sz w:val="28"/>
-          <w:szCs w:val="28"/>
-        </w:rPr>
-        <w:t xml:space="preserve">               </w:t>
-      </w:r>
-      <w:r>
-        <w:rPr>
-          <w:rFonts w:ascii="Times New Roman" w:hAnsi="Times New Roman" w:cs="Times New Roman"/>
-          <w:sz w:val="28"/>
-          <w:szCs w:val="28"/>
-        </w:rPr>
-        <w:t xml:space="preserve">                              </w:t>
-      </w:r>
-      <w:r>
-        <w:rPr>
-          <w:rFonts w:ascii="Times New Roman" w:hAnsi="Times New Roman" w:cs="Times New Roman"/>
-          <w:sz w:val="28"/>
-          <w:szCs w:val="28"/>
-        </w:rPr>
-        <w:t>lows</w:t>
-      </w:r>
-      <w:r>
-        <w:rPr>
-          <w:rFonts w:ascii="Times New Roman" w:hAnsi="Times New Roman" w:cs="Times New Roman"/>
-          <w:sz w:val="28"/>
-          <w:szCs w:val="28"/>
-        </w:rPr>
-        <w:t xml:space="preserve"> </w:t>
-      </w:r>
-      <w:r>
-        <w:rPr>
-          <w:rFonts w:ascii="Times New Roman" w:hAnsi="Times New Roman" w:cs="Times New Roman"/>
-          <w:sz w:val="28"/>
-          <w:szCs w:val="28"/>
-        </w:rPr>
-        <w:t>- ___________</w:t>
-      </w:r>
-    </w:p>
-    <w:p>
-      <w:pPr>
-        <w:suppressLineNumbers/>
-        <w:spacing w:after="0"/>
-        <w:rPr>
-          <w:rFonts w:ascii="Times New Roman" w:hAnsi="Times New Roman" w:cs="Times New Roman"/>
-          <w:sz w:val="28"/>
-          <w:szCs w:val="28"/>
-        </w:rPr>
-      </w:pPr>
-      <w:r>
-        <w:rPr>
-          <w:rFonts w:ascii="Times New Roman" w:hAnsi="Times New Roman" w:cs="Times New Roman"/>
-          <w:sz w:val="28"/>
-          <w:szCs w:val="28"/>
-        </w:rPr>
-        <w:t xml:space="preserve">            </w:t>
-      </w:r>
-      <w:r>
-        <w:rPr>
-          <w:rFonts w:ascii="Times New Roman" w:hAnsi="Times New Roman" w:cs="Times New Roman"/>
-          <w:sz w:val="28"/>
-          <w:szCs w:val="28"/>
-        </w:rPr>
-        <w:t>anbana</w:t>
-      </w:r>
-      <w:r>
-        <w:rPr>
-          <w:rFonts w:ascii="Times New Roman" w:hAnsi="Times New Roman" w:cs="Times New Roman"/>
-          <w:sz w:val="28"/>
-          <w:szCs w:val="28"/>
-        </w:rPr>
-        <w:t xml:space="preserve"> -</w:t>
-      </w:r>
-      <w:r>
-        <w:rPr>
-          <w:rFonts w:ascii="Times New Roman" w:hAnsi="Times New Roman" w:cs="Times New Roman"/>
-          <w:sz w:val="28"/>
-          <w:szCs w:val="28"/>
-        </w:rPr>
-        <w:t xml:space="preserve"> ___________</w:t>
-      </w:r>
-      <w:r>
-        <w:rPr>
-          <w:rFonts w:ascii="Times New Roman" w:hAnsi="Times New Roman" w:cs="Times New Roman"/>
-          <w:sz w:val="28"/>
-          <w:szCs w:val="28"/>
-        </w:rPr>
-        <w:t xml:space="preserve">           </w:t>
-      </w:r>
-      <w:r>
-        <w:rPr>
-          <w:rFonts w:ascii="Times New Roman" w:hAnsi="Times New Roman" w:cs="Times New Roman"/>
-          <w:sz w:val="28"/>
-          <w:szCs w:val="28"/>
-        </w:rPr>
-        <w:t xml:space="preserve">                            </w:t>
-      </w:r>
-      <w:r>
-        <w:rPr>
-          <w:rFonts w:ascii="Times New Roman" w:hAnsi="Times New Roman" w:cs="Times New Roman"/>
-          <w:sz w:val="28"/>
-          <w:szCs w:val="28"/>
-        </w:rPr>
-        <w:t xml:space="preserve"> </w:t>
-      </w:r>
-      <w:r>
-        <w:rPr>
-          <w:rFonts w:ascii="Times New Roman" w:hAnsi="Times New Roman" w:cs="Times New Roman"/>
-          <w:sz w:val="28"/>
-          <w:szCs w:val="28"/>
-        </w:rPr>
-        <w:t>tapoto</w:t>
-      </w:r>
-      <w:r>
-        <w:rPr>
-          <w:rFonts w:ascii="Times New Roman" w:hAnsi="Times New Roman" w:cs="Times New Roman"/>
-          <w:sz w:val="28"/>
-          <w:szCs w:val="28"/>
-        </w:rPr>
-        <w:t xml:space="preserve"> </w:t>
-      </w:r>
-      <w:r>
-        <w:rPr>
-          <w:rFonts w:ascii="Times New Roman" w:hAnsi="Times New Roman" w:cs="Times New Roman"/>
-          <w:sz w:val="28"/>
-          <w:szCs w:val="28"/>
-        </w:rPr>
-        <w:t>- ___________</w:t>
-      </w:r>
-    </w:p>
-    <w:p>
-      <w:pPr>
-        <w:suppressLineNumbers/>
-        <w:spacing w:after="0"/>
-        <w:rPr>
-          <w:rFonts w:ascii="Times New Roman" w:hAnsi="Times New Roman" w:cs="Times New Roman"/>
-          <w:b/>
-          <w:bCs/>
-          <w:sz w:val="28"/>
-          <w:szCs w:val="28"/>
-        </w:rPr>
-      </w:pPr>
-      <w:r>
-        <w:rPr>
-          <w:rFonts w:ascii="Times New Roman" w:hAnsi="Times New Roman" w:cs="Times New Roman"/>
-          <w:b/>
-          <w:bCs/>
-          <w:sz w:val="28"/>
-          <w:szCs w:val="28"/>
-        </w:rPr>
-        <w:t xml:space="preserve">q.no 8. Write </w:t>
-      </w:r>
-      <w:r>
-        <w:rPr>
-          <w:rFonts w:ascii="Times New Roman" w:hAnsi="Times New Roman" w:cs="Times New Roman"/>
-          <w:b/>
-          <w:bCs/>
-          <w:sz w:val="28"/>
-          <w:szCs w:val="28"/>
-        </w:rPr>
-        <w:t xml:space="preserve">similar words.                                  </w:t>
-      </w:r>
-      <w:r>
-        <w:rPr>
-          <w:rFonts w:ascii="Times New Roman" w:hAnsi="Times New Roman" w:cs="Times New Roman"/>
-          <w:b/>
-          <w:bCs/>
-          <w:sz w:val="28"/>
-          <w:szCs w:val="28"/>
-        </w:rPr>
-        <w:t xml:space="preserve">  </w:t>
-      </w:r>
-      <w:r>
-        <w:rPr>
-          <w:rFonts w:ascii="Times New Roman" w:hAnsi="Times New Roman" w:cs="Times New Roman"/>
-          <w:b/>
-          <w:bCs/>
-          <w:sz w:val="28"/>
-          <w:szCs w:val="28"/>
-        </w:rPr>
-        <w:t xml:space="preserve">                           </w:t>
-      </w:r>
-      <w:r>
-        <w:rPr>
-          <w:rFonts w:ascii="Times New Roman" w:hAnsi="Times New Roman" w:cs="Times New Roman"/>
-          <w:b/>
-          <w:bCs/>
-          <w:sz w:val="28"/>
-          <w:szCs w:val="28"/>
-        </w:rPr>
-        <w:t xml:space="preserve">   </w:t>
-      </w:r>
-      <w:r>
-        <w:rPr>
-          <w:rFonts w:ascii="Times New Roman" w:hAnsi="Times New Roman" w:cs="Times New Roman"/>
-          <w:b/>
-          <w:bCs/>
-          <w:sz w:val="28"/>
-          <w:szCs w:val="28"/>
-        </w:rPr>
-        <w:tab/>
-      </w:r>
-      <w:r>
-        <w:rPr>
-          <w:rFonts w:ascii="Times New Roman" w:hAnsi="Times New Roman" w:cs="Times New Roman"/>
-          <w:b/>
-          <w:bCs/>
-          <w:sz w:val="28"/>
-          <w:szCs w:val="28"/>
-        </w:rPr>
-        <w:tab/>
-      </w:r>
-      <w:r>
-        <w:rPr>
-          <w:rFonts w:ascii="Times New Roman" w:hAnsi="Times New Roman" w:cs="Times New Roman"/>
-          <w:b/>
-          <w:bCs/>
-          <w:sz w:val="28"/>
-          <w:szCs w:val="28"/>
-        </w:rPr>
-        <w:t>[4]</w:t>
+          <w:b/>
+          <w:bCs/>
+          <w:sz w:val="28"/>
+          <w:szCs w:val="28"/>
+        </w:rPr>
+        <w:t>[10]</w:t>
       </w:r>
     </w:p>
     <w:p>
@@ -3596,39 +3899,23 @@
           <w:sz w:val="28"/>
           <w:szCs w:val="28"/>
         </w:rPr>
-        <w:t xml:space="preserve">          a) </w:t>
-      </w:r>
-      <w:r>
-        <w:rPr>
-          <w:rFonts w:ascii="Times New Roman" w:hAnsi="Times New Roman" w:cs="Times New Roman"/>
-          <w:sz w:val="28"/>
-          <w:szCs w:val="28"/>
-        </w:rPr>
-        <w:t xml:space="preserve"> Beautiful- </w:t>
-      </w:r>
-      <w:r>
-        <w:rPr>
-          <w:rFonts w:ascii="Times New Roman" w:hAnsi="Times New Roman" w:cs="Times New Roman"/>
-          <w:sz w:val="28"/>
-          <w:szCs w:val="28"/>
-        </w:rPr>
-        <w:t>___________</w:t>
-      </w:r>
-      <w:r>
-        <w:rPr>
-          <w:rFonts w:ascii="Times New Roman" w:hAnsi="Times New Roman" w:cs="Times New Roman"/>
-          <w:sz w:val="28"/>
-          <w:szCs w:val="28"/>
-        </w:rPr>
-        <w:t xml:space="preserve">                                  c) Rush-</w:t>
-      </w:r>
-      <w:r>
-        <w:rPr>
-          <w:rFonts w:ascii="Times New Roman" w:hAnsi="Times New Roman" w:cs="Times New Roman"/>
-          <w:sz w:val="28"/>
-          <w:szCs w:val="28"/>
-        </w:rPr>
-        <w:t xml:space="preserve"> ___________</w:t>
+        <w:t xml:space="preserve">         a) </w:t>
+      </w:r>
+      <w:r>
+        <w:rPr>
+          <w:rFonts w:ascii="Times New Roman" w:hAnsi="Times New Roman" w:cs="Times New Roman"/>
+          <w:sz w:val="28"/>
+          <w:szCs w:val="28"/>
+        </w:rPr>
+        <w:t>Who likes something green</w:t>
+      </w:r>
+      <w:r>
+        <w:rPr>
+          <w:rFonts w:ascii="Times New Roman" w:hAnsi="Times New Roman" w:cs="Times New Roman"/>
+          <w:sz w:val="28"/>
+          <w:szCs w:val="28"/>
+        </w:rPr>
+        <w:t>?</w:t>
       </w:r>
     </w:p>
     <w:p>
@@ -3647,7 +3934,15 @@
           <w:sz w:val="28"/>
           <w:szCs w:val="28"/>
         </w:rPr>
-        <w:t xml:space="preserve">          b)  Forest- </w:t>
+        <w:t xml:space="preserve">             ____________________________</w:t>
+      </w:r>
+      <w:r>
+        <w:rPr>
+          <w:rFonts w:ascii="Times New Roman" w:hAnsi="Times New Roman" w:cs="Times New Roman"/>
+          <w:sz w:val="28"/>
+          <w:szCs w:val="28"/>
+        </w:rPr>
+        <w:t>_____</w:t>
       </w:r>
       <w:r>
         <w:rPr>
@@ -3663,88 +3958,7 @@
           <w:sz w:val="28"/>
           <w:szCs w:val="28"/>
         </w:rPr>
-        <w:t xml:space="preserve">                                       d) Foolish-</w:t>
-      </w:r>
-      <w:r>
-        <w:rPr>
-          <w:rFonts w:ascii="Times New Roman" w:hAnsi="Times New Roman" w:cs="Times New Roman"/>
-          <w:sz w:val="28"/>
-          <w:szCs w:val="28"/>
-        </w:rPr>
-        <w:t xml:space="preserve"> ___________</w:t>
-      </w:r>
-    </w:p>
-    <w:p>
-      <w:pPr>
-        <w:suppressLineNumbers/>
-        <w:spacing w:after="0" w:line="240" w:lineRule="auto"/>
-        <w:rPr>
-          <w:rFonts w:ascii="Times New Roman" w:hAnsi="Times New Roman" w:cs="Times New Roman"/>
-          <w:b/>
-          <w:bCs/>
-          <w:sz w:val="28"/>
-          <w:szCs w:val="28"/>
-        </w:rPr>
-      </w:pPr>
-      <w:r>
-        <w:rPr>
-          <w:rFonts w:ascii="Times New Roman" w:hAnsi="Times New Roman" w:cs="Times New Roman"/>
-          <w:b/>
-          <w:bCs/>
-          <w:sz w:val="28"/>
-          <w:szCs w:val="28"/>
-        </w:rPr>
-        <w:t xml:space="preserve">Q.no 9. Answer the questions.                                              </w:t>
-      </w:r>
-      <w:r>
-        <w:rPr>
-          <w:rFonts w:ascii="Times New Roman" w:hAnsi="Times New Roman" w:cs="Times New Roman"/>
-          <w:b/>
-          <w:bCs/>
-          <w:sz w:val="28"/>
-          <w:szCs w:val="28"/>
-        </w:rPr>
-        <w:t xml:space="preserve">                       </w:t>
-      </w:r>
-      <w:r>
-        <w:rPr>
-          <w:rFonts w:ascii="Times New Roman" w:hAnsi="Times New Roman" w:cs="Times New Roman"/>
-          <w:b/>
-          <w:bCs/>
-          <w:sz w:val="28"/>
-          <w:szCs w:val="28"/>
-        </w:rPr>
-        <w:t xml:space="preserve">   </w:t>
-      </w:r>
-      <w:r>
-        <w:rPr>
-          <w:rFonts w:ascii="Times New Roman" w:hAnsi="Times New Roman" w:cs="Times New Roman"/>
-          <w:b/>
-          <w:bCs/>
-          <w:sz w:val="28"/>
-          <w:szCs w:val="28"/>
-        </w:rPr>
-        <w:tab/>
-      </w:r>
-      <w:r>
-        <w:rPr>
-          <w:rFonts w:ascii="Times New Roman" w:hAnsi="Times New Roman" w:cs="Times New Roman"/>
-          <w:b/>
-          <w:bCs/>
-          <w:sz w:val="28"/>
-          <w:szCs w:val="28"/>
-        </w:rPr>
-        <w:tab/>
-      </w:r>
-      <w:r>
-        <w:rPr>
-          <w:rFonts w:ascii="Times New Roman" w:hAnsi="Times New Roman" w:cs="Times New Roman"/>
-          <w:b/>
-          <w:bCs/>
-          <w:sz w:val="28"/>
-          <w:szCs w:val="28"/>
-        </w:rPr>
-        <w:t>[10]</w:t>
+        <w:t>________________________</w:t>
       </w:r>
     </w:p>
     <w:p>
@@ -3763,15 +3977,15 @@
           <w:sz w:val="28"/>
           <w:szCs w:val="28"/>
         </w:rPr>
-        <w:t xml:space="preserve">         a) </w:t>
-      </w:r>
-      <w:r>
-        <w:rPr>
-          <w:rFonts w:ascii="Times New Roman" w:hAnsi="Times New Roman" w:cs="Times New Roman"/>
-          <w:sz w:val="28"/>
-          <w:szCs w:val="28"/>
-        </w:rPr>
-        <w:t>Who likes something green</w:t>
+        <w:t xml:space="preserve">         b) </w:t>
+      </w:r>
+      <w:r>
+        <w:rPr>
+          <w:rFonts w:ascii="Times New Roman" w:hAnsi="Times New Roman" w:cs="Times New Roman"/>
+          <w:sz w:val="28"/>
+          <w:szCs w:val="28"/>
+        </w:rPr>
+        <w:t>Where is grandpa</w:t>
       </w:r>
       <w:r>
         <w:rPr>
@@ -3798,15 +4012,15 @@
           <w:sz w:val="28"/>
           <w:szCs w:val="28"/>
         </w:rPr>
-        <w:t xml:space="preserve">             ____________________________</w:t>
-      </w:r>
-      <w:r>
-        <w:rPr>
-          <w:rFonts w:ascii="Times New Roman" w:hAnsi="Times New Roman" w:cs="Times New Roman"/>
-          <w:sz w:val="28"/>
-          <w:szCs w:val="28"/>
-        </w:rPr>
-        <w:t>_____</w:t>
+        <w:t xml:space="preserve">              ____________________________</w:t>
+      </w:r>
+      <w:r>
+        <w:rPr>
+          <w:rFonts w:ascii="Times New Roman" w:hAnsi="Times New Roman" w:cs="Times New Roman"/>
+          <w:sz w:val="28"/>
+          <w:szCs w:val="28"/>
+        </w:rPr>
+        <w:t>______</w:t>
       </w:r>
       <w:r>
         <w:rPr>
@@ -3822,7 +4036,7 @@
           <w:sz w:val="28"/>
           <w:szCs w:val="28"/>
         </w:rPr>
-        <w:t>________________________</w:t>
+        <w:t>______________________</w:t>
       </w:r>
     </w:p>
     <w:p>
@@ -3841,15 +4055,15 @@
           <w:sz w:val="28"/>
           <w:szCs w:val="28"/>
         </w:rPr>
-        <w:t xml:space="preserve">         b) </w:t>
-      </w:r>
-      <w:r>
-        <w:rPr>
-          <w:rFonts w:ascii="Times New Roman" w:hAnsi="Times New Roman" w:cs="Times New Roman"/>
-          <w:sz w:val="28"/>
-          <w:szCs w:val="28"/>
-        </w:rPr>
-        <w:t>Where is grandpa</w:t>
+        <w:t xml:space="preserve">         c) </w:t>
+      </w:r>
+      <w:r>
+        <w:rPr>
+          <w:rFonts w:ascii="Times New Roman" w:hAnsi="Times New Roman" w:cs="Times New Roman"/>
+          <w:sz w:val="28"/>
+          <w:szCs w:val="28"/>
+        </w:rPr>
+        <w:t>Which fruits does Mohan like</w:t>
       </w:r>
       <w:r>
         <w:rPr>
@@ -3876,15 +4090,15 @@
           <w:sz w:val="28"/>
           <w:szCs w:val="28"/>
         </w:rPr>
-        <w:t xml:space="preserve">              ____________________________</w:t>
-      </w:r>
-      <w:r>
-        <w:rPr>
-          <w:rFonts w:ascii="Times New Roman" w:hAnsi="Times New Roman" w:cs="Times New Roman"/>
-          <w:sz w:val="28"/>
-          <w:szCs w:val="28"/>
-        </w:rPr>
-        <w:t>______</w:t>
+        <w:t xml:space="preserve">               ____________________________</w:t>
+      </w:r>
+      <w:r>
+        <w:rPr>
+          <w:rFonts w:ascii="Times New Roman" w:hAnsi="Times New Roman" w:cs="Times New Roman"/>
+          <w:sz w:val="28"/>
+          <w:szCs w:val="28"/>
+        </w:rPr>
+        <w:t>_______________</w:t>
       </w:r>
       <w:r>
         <w:rPr>
@@ -3900,7 +4114,7 @@
           <w:sz w:val="28"/>
           <w:szCs w:val="28"/>
         </w:rPr>
-        <w:t>______________________</w:t>
+        <w:t>_____________</w:t>
       </w:r>
     </w:p>
     <w:p>
@@ -3919,84 +4133,6 @@
           <w:sz w:val="28"/>
           <w:szCs w:val="28"/>
         </w:rPr>
-        <w:t xml:space="preserve">         c) </w:t>
-      </w:r>
-      <w:r>
-        <w:rPr>
-          <w:rFonts w:ascii="Times New Roman" w:hAnsi="Times New Roman" w:cs="Times New Roman"/>
-          <w:sz w:val="28"/>
-          <w:szCs w:val="28"/>
-        </w:rPr>
-        <w:t>Which fruits does Mohan like</w:t>
-      </w:r>
-      <w:r>
-        <w:rPr>
-          <w:rFonts w:ascii="Times New Roman" w:hAnsi="Times New Roman" w:cs="Times New Roman"/>
-          <w:sz w:val="28"/>
-          <w:szCs w:val="28"/>
-        </w:rPr>
-        <w:t>?</w:t>
-      </w:r>
-    </w:p>
-    <w:p>
-      <w:pPr>
-        <w:suppressLineNumbers/>
-        <w:spacing w:after="0" w:line="360" w:lineRule="auto"/>
-        <w:rPr>
-          <w:rFonts w:ascii="Times New Roman" w:hAnsi="Times New Roman" w:cs="Times New Roman"/>
-          <w:sz w:val="28"/>
-          <w:szCs w:val="28"/>
-        </w:rPr>
-      </w:pPr>
-      <w:r>
-        <w:rPr>
-          <w:rFonts w:ascii="Times New Roman" w:hAnsi="Times New Roman" w:cs="Times New Roman"/>
-          <w:sz w:val="28"/>
-          <w:szCs w:val="28"/>
-        </w:rPr>
-        <w:t xml:space="preserve">               ____________________________</w:t>
-      </w:r>
-      <w:r>
-        <w:rPr>
-          <w:rFonts w:ascii="Times New Roman" w:hAnsi="Times New Roman" w:cs="Times New Roman"/>
-          <w:sz w:val="28"/>
-          <w:szCs w:val="28"/>
-        </w:rPr>
-        <w:t>_______________</w:t>
-      </w:r>
-      <w:r>
-        <w:rPr>
-          <w:rFonts w:ascii="Times New Roman" w:hAnsi="Times New Roman" w:cs="Times New Roman"/>
-          <w:sz w:val="28"/>
-          <w:szCs w:val="28"/>
-        </w:rPr>
-        <w:t>___________</w:t>
-      </w:r>
-      <w:r>
-        <w:rPr>
-          <w:rFonts w:ascii="Times New Roman" w:hAnsi="Times New Roman" w:cs="Times New Roman"/>
-          <w:sz w:val="28"/>
-          <w:szCs w:val="28"/>
-        </w:rPr>
-        <w:t>_____________</w:t>
-      </w:r>
-    </w:p>
-    <w:p>
-      <w:pPr>
-        <w:suppressLineNumbers/>
-        <w:spacing w:after="0" w:line="360" w:lineRule="auto"/>
-        <w:rPr>
-          <w:rFonts w:ascii="Times New Roman" w:hAnsi="Times New Roman" w:cs="Times New Roman"/>
-          <w:sz w:val="28"/>
-          <w:szCs w:val="28"/>
-        </w:rPr>
-      </w:pPr>
-      <w:r>
-        <w:rPr>
-          <w:rFonts w:ascii="Times New Roman" w:hAnsi="Times New Roman" w:cs="Times New Roman"/>
-          <w:sz w:val="28"/>
-          <w:szCs w:val="28"/>
-        </w:rPr>
         <w:t xml:space="preserve">         d) </w:t>
       </w:r>
       <w:r>
@@ -4510,24 +4646,6 @@
         </w:rPr>
         <w:t>The End</w:t>
       </w:r>
-      <w:r>
-        <w:rPr>
-          <w:rFonts w:ascii="Times New Roman" w:hAnsi="Times New Roman" w:cs="Times New Roman"/>
-          <w:szCs w:val="22"/>
-        </w:rPr>
-        <w:t xml:space="preserve">                                                                                                                             </w:t>
-      </w:r>
-    </w:p>
-    <w:p>
-      <w:pPr>
-        <w:spacing w:before="240" w:after="0" w:line="240" w:lineRule="auto"/>
-        <w:ind w:left="2160" w:hanging="2160"/>
-        <w:jc w:val="center"/>
-        <w:rPr>
-          <w:rFonts w:ascii="Times New Roman" w:hAnsi="Times New Roman" w:cs="Times New Roman"/>
-          <w:szCs w:val="22"/>
-        </w:rPr>
-      </w:pPr>
     </w:p>
     <w:sectPr>
       <w:pgSz w:w="11907" w:h="16839" w:code="9"/>

</xml_diff>